<commit_message>
Variety of small changes in preparation for next review with working group members
</commit_message>
<xml_diff>
--- a/scenarios/FastFedScenario_1A_with_SAML_and_SCIM.docx
+++ b/scenarios/FastFedScenario_1A_with_SAML_and_SCIM.docx
@@ -2615,7 +2615,16 @@
                 <w:sz w:val="18"/>
                 <w:szCs w:val="18"/>
               </w:rPr>
-              <w:t>.com/fastfed/receive</w:t>
+              <w:t>.com/fastfed/</w:t>
+            </w:r>
+            <w:r>
+              <w:rPr>
+                <w:rFonts w:ascii="Courier New" w:hAnsi="Courier New" w:cs="Courier New"/>
+                <w:noProof/>
+                <w:sz w:val="18"/>
+                <w:szCs w:val="18"/>
+              </w:rPr>
+              <w:t>start</w:t>
             </w:r>
             <w:r>
               <w:rPr>
@@ -3962,6 +3971,15 @@
                 <w:sz w:val="18"/>
                 <w:szCs w:val="18"/>
               </w:rPr>
+              <w:t>/finish</w:t>
+            </w:r>
+            <w:r>
+              <w:rPr>
+                <w:rFonts w:ascii="Courier New" w:hAnsi="Courier New" w:cs="Courier New"/>
+                <w:noProof/>
+                <w:sz w:val="18"/>
+                <w:szCs w:val="18"/>
+              </w:rPr>
               <w:t>",</w:t>
             </w:r>
           </w:p>
@@ -4373,7 +4391,313 @@
                 <w:sz w:val="18"/>
                 <w:szCs w:val="18"/>
               </w:rPr>
-              <w:t xml:space="preserve">  "authentication_profile":</w:t>
+              <w:t xml:space="preserve">  "state": "liK9x2fUOWoi1P0",</w:t>
+            </w:r>
+          </w:p>
+          <w:p>
+            <w:pPr>
+              <w:rPr>
+                <w:rFonts w:ascii="Courier New" w:hAnsi="Courier New" w:cs="Courier New"/>
+                <w:noProof/>
+                <w:sz w:val="18"/>
+                <w:szCs w:val="18"/>
+              </w:rPr>
+            </w:pPr>
+            <w:r>
+              <w:rPr>
+                <w:rFonts w:ascii="Courier New" w:hAnsi="Courier New" w:cs="Courier New"/>
+                <w:noProof/>
+                <w:sz w:val="18"/>
+                <w:szCs w:val="18"/>
+              </w:rPr>
+              <w:t xml:space="preserve">  "schema": "urn:ietf:params:scim:schemas:core:2.0:User",</w:t>
+            </w:r>
+          </w:p>
+          <w:p>
+            <w:pPr>
+              <w:rPr>
+                <w:rFonts w:ascii="Courier New" w:hAnsi="Courier New" w:cs="Courier New"/>
+                <w:noProof/>
+                <w:sz w:val="18"/>
+                <w:szCs w:val="18"/>
+              </w:rPr>
+            </w:pPr>
+            <w:r>
+              <w:rPr>
+                <w:rFonts w:ascii="Courier New" w:hAnsi="Courier New" w:cs="Courier New"/>
+                <w:noProof/>
+                <w:sz w:val="18"/>
+                <w:szCs w:val="18"/>
+              </w:rPr>
+              <w:t xml:space="preserve">  "authentication_profile</w:t>
+            </w:r>
+            <w:r>
+              <w:rPr>
+                <w:rFonts w:ascii="Courier New" w:hAnsi="Courier New" w:cs="Courier New"/>
+                <w:noProof/>
+                <w:sz w:val="18"/>
+                <w:szCs w:val="18"/>
+              </w:rPr>
+              <w:t>s</w:t>
+            </w:r>
+            <w:r>
+              <w:rPr>
+                <w:rFonts w:ascii="Courier New" w:hAnsi="Courier New" w:cs="Courier New"/>
+                <w:noProof/>
+                <w:sz w:val="18"/>
+                <w:szCs w:val="18"/>
+              </w:rPr>
+              <w:t>":</w:t>
+            </w:r>
+            <w:r>
+              <w:rPr>
+                <w:rFonts w:ascii="Courier New" w:hAnsi="Courier New" w:cs="Courier New"/>
+                <w:noProof/>
+                <w:sz w:val="18"/>
+                <w:szCs w:val="18"/>
+              </w:rPr>
+              <w:t xml:space="preserve"> [</w:t>
+            </w:r>
+          </w:p>
+          <w:p>
+            <w:pPr>
+              <w:rPr>
+                <w:rFonts w:ascii="Courier New" w:hAnsi="Courier New" w:cs="Courier New"/>
+                <w:noProof/>
+                <w:sz w:val="18"/>
+                <w:szCs w:val="18"/>
+              </w:rPr>
+            </w:pPr>
+            <w:r>
+              <w:rPr>
+                <w:rFonts w:ascii="Courier New" w:hAnsi="Courier New" w:cs="Courier New"/>
+                <w:noProof/>
+                <w:sz w:val="18"/>
+                <w:szCs w:val="18"/>
+              </w:rPr>
+              <w:t xml:space="preserve">    </w:t>
+            </w:r>
+            <w:r>
+              <w:rPr>
+                <w:rFonts w:ascii="Courier New" w:hAnsi="Courier New" w:cs="Courier New"/>
+                <w:noProof/>
+                <w:sz w:val="18"/>
+                <w:szCs w:val="18"/>
+              </w:rPr>
+              <w:t>"urn:ietf:params:fastfed:1.0:authentication:SAML:Basic"</w:t>
+            </w:r>
+          </w:p>
+          <w:p>
+            <w:pPr>
+              <w:rPr>
+                <w:rFonts w:ascii="Courier New" w:hAnsi="Courier New" w:cs="Courier New"/>
+                <w:noProof/>
+                <w:sz w:val="18"/>
+                <w:szCs w:val="18"/>
+              </w:rPr>
+            </w:pPr>
+            <w:r>
+              <w:rPr>
+                <w:rFonts w:ascii="Courier New" w:hAnsi="Courier New" w:cs="Courier New"/>
+                <w:noProof/>
+                <w:sz w:val="18"/>
+                <w:szCs w:val="18"/>
+              </w:rPr>
+              <w:t xml:space="preserve">  ]</w:t>
+            </w:r>
+            <w:r>
+              <w:rPr>
+                <w:rFonts w:ascii="Courier New" w:hAnsi="Courier New" w:cs="Courier New"/>
+                <w:noProof/>
+                <w:sz w:val="18"/>
+                <w:szCs w:val="18"/>
+              </w:rPr>
+              <w:t>,</w:t>
+            </w:r>
+          </w:p>
+          <w:p>
+            <w:pPr>
+              <w:rPr>
+                <w:rFonts w:ascii="Courier New" w:hAnsi="Courier New" w:cs="Courier New"/>
+                <w:noProof/>
+                <w:sz w:val="18"/>
+                <w:szCs w:val="18"/>
+              </w:rPr>
+            </w:pPr>
+            <w:r>
+              <w:rPr>
+                <w:rFonts w:ascii="Courier New" w:hAnsi="Courier New" w:cs="Courier New"/>
+                <w:noProof/>
+                <w:sz w:val="18"/>
+                <w:szCs w:val="18"/>
+              </w:rPr>
+              <w:t xml:space="preserve">  "provisioning_profile</w:t>
+            </w:r>
+            <w:r>
+              <w:rPr>
+                <w:rFonts w:ascii="Courier New" w:hAnsi="Courier New" w:cs="Courier New"/>
+                <w:noProof/>
+                <w:sz w:val="18"/>
+                <w:szCs w:val="18"/>
+              </w:rPr>
+              <w:t>s</w:t>
+            </w:r>
+            <w:r>
+              <w:rPr>
+                <w:rFonts w:ascii="Courier New" w:hAnsi="Courier New" w:cs="Courier New"/>
+                <w:noProof/>
+                <w:sz w:val="18"/>
+                <w:szCs w:val="18"/>
+              </w:rPr>
+              <w:t>":</w:t>
+            </w:r>
+            <w:r>
+              <w:rPr>
+                <w:rFonts w:ascii="Courier New" w:hAnsi="Courier New" w:cs="Courier New"/>
+                <w:noProof/>
+                <w:sz w:val="18"/>
+                <w:szCs w:val="18"/>
+              </w:rPr>
+              <w:t xml:space="preserve"> [</w:t>
+            </w:r>
+          </w:p>
+          <w:p>
+            <w:pPr>
+              <w:rPr>
+                <w:rFonts w:ascii="Courier New" w:hAnsi="Courier New" w:cs="Courier New"/>
+                <w:noProof/>
+                <w:sz w:val="18"/>
+                <w:szCs w:val="18"/>
+              </w:rPr>
+            </w:pPr>
+            <w:r>
+              <w:rPr>
+                <w:rFonts w:ascii="Courier New" w:hAnsi="Courier New" w:cs="Courier New"/>
+                <w:noProof/>
+                <w:sz w:val="18"/>
+                <w:szCs w:val="18"/>
+              </w:rPr>
+              <w:t xml:space="preserve"> </w:t>
+            </w:r>
+            <w:r>
+              <w:rPr>
+                <w:rFonts w:ascii="Courier New" w:hAnsi="Courier New" w:cs="Courier New"/>
+                <w:noProof/>
+                <w:sz w:val="18"/>
+                <w:szCs w:val="18"/>
+              </w:rPr>
+              <w:t xml:space="preserve">   </w:t>
+            </w:r>
+            <w:r>
+              <w:rPr>
+                <w:rFonts w:ascii="Courier New" w:hAnsi="Courier New" w:cs="Courier New"/>
+                <w:noProof/>
+                <w:sz w:val="18"/>
+                <w:szCs w:val="18"/>
+              </w:rPr>
+              <w:t>"urn:ietf:params:fastfed:1.0:provisioning:SCIM:FullLifeCycle"</w:t>
+            </w:r>
+          </w:p>
+          <w:p>
+            <w:pPr>
+              <w:rPr>
+                <w:rFonts w:ascii="Courier New" w:hAnsi="Courier New" w:cs="Courier New"/>
+                <w:noProof/>
+                <w:sz w:val="18"/>
+                <w:szCs w:val="18"/>
+              </w:rPr>
+            </w:pPr>
+            <w:r>
+              <w:rPr>
+                <w:rFonts w:ascii="Courier New" w:hAnsi="Courier New" w:cs="Courier New"/>
+                <w:noProof/>
+                <w:sz w:val="18"/>
+                <w:szCs w:val="18"/>
+              </w:rPr>
+              <w:t xml:space="preserve">  ],</w:t>
+            </w:r>
+          </w:p>
+          <w:p>
+            <w:pPr>
+              <w:rPr>
+                <w:rFonts w:ascii="Courier New" w:hAnsi="Courier New" w:cs="Courier New"/>
+                <w:noProof/>
+                <w:sz w:val="18"/>
+                <w:szCs w:val="18"/>
+              </w:rPr>
+            </w:pPr>
+            <w:r>
+              <w:rPr>
+                <w:rFonts w:ascii="Courier New" w:hAnsi="Courier New" w:cs="Courier New"/>
+                <w:noProof/>
+                <w:sz w:val="18"/>
+                <w:szCs w:val="18"/>
+              </w:rPr>
+              <w:t xml:space="preserve">  </w:t>
+            </w:r>
+            <w:r>
+              <w:rPr>
+                <w:rFonts w:ascii="Courier New" w:hAnsi="Courier New" w:cs="Courier New"/>
+                <w:noProof/>
+                <w:sz w:val="18"/>
+                <w:szCs w:val="18"/>
+              </w:rPr>
+              <w:t>"urn:ietf:params:fastfed:1.0:authentication:SAML:Basic"</w:t>
+            </w:r>
+            <w:r>
+              <w:rPr>
+                <w:rFonts w:ascii="Courier New" w:hAnsi="Courier New" w:cs="Courier New"/>
+                <w:noProof/>
+                <w:sz w:val="18"/>
+                <w:szCs w:val="18"/>
+              </w:rPr>
+              <w:t>: {</w:t>
+            </w:r>
+          </w:p>
+          <w:p>
+            <w:pPr>
+              <w:rPr>
+                <w:rFonts w:ascii="Courier New" w:hAnsi="Courier New" w:cs="Courier New"/>
+                <w:noProof/>
+                <w:sz w:val="18"/>
+                <w:szCs w:val="18"/>
+              </w:rPr>
+            </w:pPr>
+            <w:r>
+              <w:rPr>
+                <w:rFonts w:ascii="Courier New" w:hAnsi="Courier New" w:cs="Courier New"/>
+                <w:noProof/>
+                <w:sz w:val="18"/>
+                <w:szCs w:val="18"/>
+              </w:rPr>
+              <w:t xml:space="preserve">  </w:t>
+            </w:r>
+            <w:r>
+              <w:rPr>
+                <w:rFonts w:ascii="Courier New" w:hAnsi="Courier New" w:cs="Courier New"/>
+                <w:noProof/>
+                <w:sz w:val="18"/>
+                <w:szCs w:val="18"/>
+              </w:rPr>
+              <w:t xml:space="preserve">  </w:t>
+            </w:r>
+            <w:r>
+              <w:rPr>
+                <w:rFonts w:ascii="Courier New" w:hAnsi="Courier New" w:cs="Courier New"/>
+                <w:noProof/>
+                <w:sz w:val="18"/>
+                <w:szCs w:val="18"/>
+              </w:rPr>
+              <w:t>"saml_metatadata_uri":</w:t>
+            </w:r>
+            <w:r>
+              <w:rPr>
+                <w:rFonts w:ascii="Courier New" w:hAnsi="Courier New" w:cs="Courier New"/>
+                <w:noProof/>
+                <w:sz w:val="18"/>
+                <w:szCs w:val="18"/>
+              </w:rPr>
+              <w:t xml:space="preserve"> </w:t>
             </w:r>
           </w:p>
           <w:p>
@@ -4401,120 +4725,7 @@
                 <w:sz w:val="18"/>
                 <w:szCs w:val="18"/>
               </w:rPr>
-              <w:t>"urn:ietf:params:fastfed:1.0:authentication:SAML:Basic",</w:t>
-            </w:r>
-          </w:p>
-          <w:p>
-            <w:pPr>
-              <w:rPr>
-                <w:rFonts w:ascii="Courier New" w:hAnsi="Courier New" w:cs="Courier New"/>
-                <w:noProof/>
-                <w:sz w:val="18"/>
-                <w:szCs w:val="18"/>
-              </w:rPr>
-            </w:pPr>
-            <w:r>
-              <w:rPr>
-                <w:rFonts w:ascii="Courier New" w:hAnsi="Courier New" w:cs="Courier New"/>
-                <w:noProof/>
-                <w:sz w:val="18"/>
-                <w:szCs w:val="18"/>
-              </w:rPr>
-              <w:t xml:space="preserve">  "provisioning_profile":</w:t>
-            </w:r>
-          </w:p>
-          <w:p>
-            <w:pPr>
-              <w:rPr>
-                <w:rFonts w:ascii="Courier New" w:hAnsi="Courier New" w:cs="Courier New"/>
-                <w:noProof/>
-                <w:sz w:val="18"/>
-                <w:szCs w:val="18"/>
-              </w:rPr>
-            </w:pPr>
-            <w:r>
-              <w:rPr>
-                <w:rFonts w:ascii="Courier New" w:hAnsi="Courier New" w:cs="Courier New"/>
-                <w:noProof/>
-                <w:sz w:val="18"/>
-                <w:szCs w:val="18"/>
-              </w:rPr>
-              <w:t xml:space="preserve"> </w:t>
-            </w:r>
-            <w:r>
-              <w:rPr>
-                <w:rFonts w:ascii="Courier New" w:hAnsi="Courier New" w:cs="Courier New"/>
-                <w:noProof/>
-                <w:sz w:val="18"/>
-                <w:szCs w:val="18"/>
-              </w:rPr>
-              <w:t xml:space="preserve">     </w:t>
-            </w:r>
-            <w:r>
-              <w:rPr>
-                <w:rFonts w:ascii="Courier New" w:hAnsi="Courier New" w:cs="Courier New"/>
-                <w:noProof/>
-                <w:sz w:val="18"/>
-                <w:szCs w:val="18"/>
-              </w:rPr>
-              <w:t>"urn:ietf:params:fastfed:1.0:provisioning:SCIM:FullLifeCycle",</w:t>
-            </w:r>
-          </w:p>
-          <w:p>
-            <w:pPr>
-              <w:rPr>
-                <w:rFonts w:ascii="Courier New" w:hAnsi="Courier New" w:cs="Courier New"/>
-                <w:noProof/>
-                <w:sz w:val="18"/>
-                <w:szCs w:val="18"/>
-              </w:rPr>
-            </w:pPr>
-            <w:r>
-              <w:rPr>
-                <w:rFonts w:ascii="Courier New" w:hAnsi="Courier New" w:cs="Courier New"/>
-                <w:noProof/>
-                <w:sz w:val="18"/>
-                <w:szCs w:val="18"/>
-              </w:rPr>
-              <w:t xml:space="preserve">  "schema": "urn:ietf:params:scim:schemas:core:2.0:User",</w:t>
-            </w:r>
-          </w:p>
-          <w:p>
-            <w:pPr>
-              <w:rPr>
-                <w:rFonts w:ascii="Courier New" w:hAnsi="Courier New" w:cs="Courier New"/>
-                <w:noProof/>
-                <w:sz w:val="18"/>
-                <w:szCs w:val="18"/>
-              </w:rPr>
-            </w:pPr>
-            <w:r>
-              <w:rPr>
-                <w:rFonts w:ascii="Courier New" w:hAnsi="Courier New" w:cs="Courier New"/>
-                <w:noProof/>
-                <w:sz w:val="18"/>
-                <w:szCs w:val="18"/>
-              </w:rPr>
-              <w:t xml:space="preserve">  "state": "liK9x2fUOWoi1P0",</w:t>
-            </w:r>
-          </w:p>
-          <w:p>
-            <w:pPr>
-              <w:rPr>
-                <w:rFonts w:ascii="Courier New" w:hAnsi="Courier New" w:cs="Courier New"/>
-                <w:noProof/>
-                <w:sz w:val="18"/>
-                <w:szCs w:val="18"/>
-              </w:rPr>
-            </w:pPr>
-            <w:r>
-              <w:rPr>
-                <w:rFonts w:ascii="Courier New" w:hAnsi="Courier New" w:cs="Courier New"/>
-                <w:noProof/>
-                <w:sz w:val="18"/>
-                <w:szCs w:val="18"/>
-              </w:rPr>
-              <w:t xml:space="preserve">  "saml_metatadata_uri": "https://tenant-12345.</w:t>
+              <w:t>"https://tenant-12345.</w:t>
             </w:r>
             <w:r>
               <w:rPr>
@@ -4551,7 +4762,37 @@
                 <w:sz w:val="18"/>
                 <w:szCs w:val="18"/>
               </w:rPr>
-              <w:t xml:space="preserve">  "oauth_token": {</w:t>
+              <w:t xml:space="preserve">  },</w:t>
+            </w:r>
+          </w:p>
+          <w:p>
+            <w:pPr>
+              <w:rPr>
+                <w:rFonts w:ascii="Courier New" w:hAnsi="Courier New" w:cs="Courier New"/>
+                <w:noProof/>
+                <w:sz w:val="18"/>
+                <w:szCs w:val="18"/>
+              </w:rPr>
+            </w:pPr>
+            <w:r>
+              <w:rPr>
+                <w:rFonts w:ascii="Courier New" w:hAnsi="Courier New" w:cs="Courier New"/>
+                <w:noProof/>
+                <w:sz w:val="18"/>
+                <w:szCs w:val="18"/>
+              </w:rPr>
+              <w:t xml:space="preserve">  "oau</w:t>
+            </w:r>
+            <w:bookmarkStart w:id="0" w:name="_GoBack"/>
+            <w:bookmarkEnd w:id="0"/>
+            <w:r>
+              <w:rPr>
+                <w:rFonts w:ascii="Courier New" w:hAnsi="Courier New" w:cs="Courier New"/>
+                <w:noProof/>
+                <w:sz w:val="18"/>
+                <w:szCs w:val="18"/>
+              </w:rPr>
+              <w:t>th_token": {</w:t>
             </w:r>
           </w:p>
           <w:p>
@@ -4878,7 +5119,6 @@
                 <w:sz w:val="18"/>
                 <w:szCs w:val="18"/>
               </w:rPr>
-              <w:lastRenderedPageBreak/>
               <w:t xml:space="preserve">  "protected":"eyJhbGciOiJFUzI1NiJ9",</w:t>
             </w:r>
           </w:p>
@@ -5277,6 +5517,43 @@
                 <w:sz w:val="18"/>
                 <w:szCs w:val="18"/>
               </w:rPr>
+              <w:t xml:space="preserve">   </w:t>
+            </w:r>
+            <w:r>
+              <w:rPr>
+                <w:rFonts w:ascii="Courier New" w:hAnsi="Courier New" w:cs="Courier New"/>
+                <w:noProof/>
+                <w:sz w:val="18"/>
+                <w:szCs w:val="18"/>
+              </w:rPr>
+              <w:t>"urn:ietf:params:fastfed:1.0:authentication:SAML:Basic"</w:t>
+            </w:r>
+            <w:r>
+              <w:rPr>
+                <w:rFonts w:ascii="Courier New" w:hAnsi="Courier New" w:cs="Courier New"/>
+                <w:noProof/>
+                <w:sz w:val="18"/>
+                <w:szCs w:val="18"/>
+              </w:rPr>
+              <w:t>: {</w:t>
+            </w:r>
+          </w:p>
+          <w:p>
+            <w:pPr>
+              <w:rPr>
+                <w:rFonts w:ascii="Courier New" w:hAnsi="Courier New" w:cs="Courier New"/>
+                <w:noProof/>
+                <w:sz w:val="18"/>
+                <w:szCs w:val="18"/>
+              </w:rPr>
+            </w:pPr>
+            <w:r>
+              <w:rPr>
+                <w:rFonts w:ascii="Courier New" w:hAnsi="Courier New" w:cs="Courier New"/>
+                <w:noProof/>
+                <w:sz w:val="18"/>
+                <w:szCs w:val="18"/>
+              </w:rPr>
               <w:t xml:space="preserve">  </w:t>
             </w:r>
             <w:r>
@@ -5286,6 +5563,15 @@
                 <w:sz w:val="18"/>
                 <w:szCs w:val="18"/>
               </w:rPr>
+              <w:t xml:space="preserve">  </w:t>
+            </w:r>
+            <w:r>
+              <w:rPr>
+                <w:rFonts w:ascii="Courier New" w:hAnsi="Courier New" w:cs="Courier New"/>
+                <w:noProof/>
+                <w:sz w:val="18"/>
+                <w:szCs w:val="18"/>
+              </w:rPr>
               <w:t xml:space="preserve"> </w:t>
             </w:r>
             <w:r>
@@ -5314,7 +5600,25 @@
                 <w:sz w:val="18"/>
                 <w:szCs w:val="18"/>
               </w:rPr>
-              <w:t xml:space="preserve">    </w:t>
+              <w:t xml:space="preserve">  </w:t>
+            </w:r>
+            <w:r>
+              <w:rPr>
+                <w:rFonts w:ascii="Courier New" w:hAnsi="Courier New" w:cs="Courier New"/>
+                <w:noProof/>
+                <w:sz w:val="18"/>
+                <w:szCs w:val="18"/>
+              </w:rPr>
+              <w:t xml:space="preserve">  </w:t>
+            </w:r>
+            <w:r>
+              <w:rPr>
+                <w:rFonts w:ascii="Courier New" w:hAnsi="Courier New" w:cs="Courier New"/>
+                <w:noProof/>
+                <w:sz w:val="18"/>
+                <w:szCs w:val="18"/>
+              </w:rPr>
+              <w:t xml:space="preserve">  </w:t>
             </w:r>
             <w:r>
               <w:rPr>
@@ -5359,18 +5663,137 @@
                 <w:sz w:val="18"/>
                 <w:szCs w:val="18"/>
               </w:rPr>
-              <w:t>.com/saml-metadata.xml",</w:t>
-            </w:r>
-          </w:p>
-          <w:p>
-            <w:pPr>
-              <w:rPr>
-                <w:rFonts w:ascii="Courier New" w:hAnsi="Courier New" w:cs="Courier New"/>
-                <w:noProof/>
-                <w:sz w:val="18"/>
-                <w:szCs w:val="18"/>
-              </w:rPr>
-            </w:pPr>
+              <w:t>.com/saml-metadata.xml"</w:t>
+            </w:r>
+          </w:p>
+          <w:p>
+            <w:pPr>
+              <w:rPr>
+                <w:rFonts w:ascii="Courier New" w:hAnsi="Courier New" w:cs="Courier New"/>
+                <w:noProof/>
+                <w:sz w:val="18"/>
+                <w:szCs w:val="18"/>
+              </w:rPr>
+            </w:pPr>
+            <w:r>
+              <w:rPr>
+                <w:rFonts w:ascii="Courier New" w:hAnsi="Courier New" w:cs="Courier New"/>
+                <w:noProof/>
+                <w:sz w:val="18"/>
+                <w:szCs w:val="18"/>
+              </w:rPr>
+              <w:t xml:space="preserve">   },</w:t>
+            </w:r>
+          </w:p>
+          <w:p>
+            <w:pPr>
+              <w:rPr>
+                <w:rFonts w:ascii="Courier New" w:hAnsi="Courier New" w:cs="Courier New"/>
+                <w:noProof/>
+                <w:sz w:val="18"/>
+                <w:szCs w:val="18"/>
+              </w:rPr>
+            </w:pPr>
+            <w:r>
+              <w:rPr>
+                <w:rFonts w:ascii="Courier New" w:hAnsi="Courier New" w:cs="Courier New"/>
+                <w:noProof/>
+                <w:sz w:val="18"/>
+                <w:szCs w:val="18"/>
+              </w:rPr>
+              <w:t xml:space="preserve">   </w:t>
+            </w:r>
+            <w:r>
+              <w:rPr>
+                <w:rFonts w:ascii="Courier New" w:hAnsi="Courier New" w:cs="Courier New"/>
+                <w:noProof/>
+                <w:sz w:val="18"/>
+                <w:szCs w:val="18"/>
+              </w:rPr>
+              <w:t>"urn:ietf:params:fastfed:1.0:</w:t>
+            </w:r>
+            <w:r>
+              <w:rPr>
+                <w:rFonts w:ascii="Courier New" w:hAnsi="Courier New" w:cs="Courier New"/>
+                <w:noProof/>
+                <w:sz w:val="18"/>
+                <w:szCs w:val="18"/>
+              </w:rPr>
+              <w:t>provisioning</w:t>
+            </w:r>
+            <w:r>
+              <w:rPr>
+                <w:rFonts w:ascii="Courier New" w:hAnsi="Courier New" w:cs="Courier New"/>
+                <w:noProof/>
+                <w:sz w:val="18"/>
+                <w:szCs w:val="18"/>
+              </w:rPr>
+              <w:t>:S</w:t>
+            </w:r>
+            <w:r>
+              <w:rPr>
+                <w:rFonts w:ascii="Courier New" w:hAnsi="Courier New" w:cs="Courier New"/>
+                <w:noProof/>
+                <w:sz w:val="18"/>
+                <w:szCs w:val="18"/>
+              </w:rPr>
+              <w:t>CIM</w:t>
+            </w:r>
+            <w:r>
+              <w:rPr>
+                <w:rFonts w:ascii="Courier New" w:hAnsi="Courier New" w:cs="Courier New"/>
+                <w:noProof/>
+                <w:sz w:val="18"/>
+                <w:szCs w:val="18"/>
+              </w:rPr>
+              <w:t>:</w:t>
+            </w:r>
+            <w:r>
+              <w:rPr>
+                <w:rFonts w:ascii="Courier New" w:hAnsi="Courier New" w:cs="Courier New"/>
+                <w:noProof/>
+                <w:sz w:val="18"/>
+                <w:szCs w:val="18"/>
+              </w:rPr>
+              <w:t>FullLifeCycle</w:t>
+            </w:r>
+            <w:r>
+              <w:rPr>
+                <w:rFonts w:ascii="Courier New" w:hAnsi="Courier New" w:cs="Courier New"/>
+                <w:noProof/>
+                <w:sz w:val="18"/>
+                <w:szCs w:val="18"/>
+              </w:rPr>
+              <w:t>"</w:t>
+            </w:r>
+            <w:r>
+              <w:rPr>
+                <w:rFonts w:ascii="Courier New" w:hAnsi="Courier New" w:cs="Courier New"/>
+                <w:noProof/>
+                <w:sz w:val="18"/>
+                <w:szCs w:val="18"/>
+              </w:rPr>
+              <w:t>: {</w:t>
+            </w:r>
+          </w:p>
+          <w:p>
+            <w:pPr>
+              <w:rPr>
+                <w:rFonts w:ascii="Courier New" w:hAnsi="Courier New" w:cs="Courier New"/>
+                <w:noProof/>
+                <w:sz w:val="18"/>
+                <w:szCs w:val="18"/>
+              </w:rPr>
+            </w:pPr>
+            <w:r>
+              <w:rPr>
+                <w:rFonts w:ascii="Courier New" w:hAnsi="Courier New" w:cs="Courier New"/>
+                <w:noProof/>
+                <w:sz w:val="18"/>
+                <w:szCs w:val="18"/>
+              </w:rPr>
+              <w:t xml:space="preserve">  </w:t>
+            </w:r>
             <w:r>
               <w:rPr>
                 <w:rFonts w:ascii="Courier New" w:hAnsi="Courier New" w:cs="Courier New"/>
@@ -5406,10 +5829,26 @@
                 <w:sz w:val="18"/>
                 <w:szCs w:val="18"/>
               </w:rPr>
-              <w:t xml:space="preserve">    </w:t>
-            </w:r>
-            <w:bookmarkStart w:id="0" w:name="_GoBack"/>
-            <w:bookmarkEnd w:id="0"/>
+              <w:t xml:space="preserve">   </w:t>
+            </w:r>
+            <w:r>
+              <w:rPr>
+                <w:rFonts w:ascii="Courier New" w:hAnsi="Courier New" w:cs="Courier New"/>
+                <w:noProof/>
+                <w:sz w:val="18"/>
+                <w:szCs w:val="18"/>
+              </w:rPr>
+              <w:t xml:space="preserve">  </w:t>
+            </w:r>
+            <w:r>
+              <w:rPr>
+                <w:rFonts w:ascii="Courier New" w:hAnsi="Courier New" w:cs="Courier New"/>
+                <w:noProof/>
+                <w:sz w:val="18"/>
+                <w:szCs w:val="18"/>
+              </w:rPr>
+              <w:t xml:space="preserve"> </w:t>
+            </w:r>
             <w:r>
               <w:rPr>
                 <w:rFonts w:ascii="Courier New" w:hAnsi="Courier New" w:cs="Courier New"/>
@@ -5453,7 +5892,26 @@
                 <w:sz w:val="18"/>
                 <w:szCs w:val="18"/>
               </w:rPr>
-              <w:t>.com/scim",</w:t>
+              <w:t>.com/scim"</w:t>
+            </w:r>
+          </w:p>
+          <w:p>
+            <w:pPr>
+              <w:rPr>
+                <w:rFonts w:ascii="Courier New" w:hAnsi="Courier New" w:cs="Courier New"/>
+                <w:noProof/>
+                <w:sz w:val="18"/>
+                <w:szCs w:val="18"/>
+              </w:rPr>
+            </w:pPr>
+            <w:r>
+              <w:rPr>
+                <w:rFonts w:ascii="Courier New" w:hAnsi="Courier New" w:cs="Courier New"/>
+                <w:noProof/>
+                <w:sz w:val="18"/>
+                <w:szCs w:val="18"/>
+              </w:rPr>
+              <w:t xml:space="preserve">   },</w:t>
             </w:r>
           </w:p>
           <w:p>
@@ -7560,7 +8018,7 @@
 </file>
 
 <file path=customXml/itemProps1.xml><?xml version="1.0" encoding="utf-8"?>
-<ds:datastoreItem xmlns:ds="http://schemas.openxmlformats.org/officeDocument/2006/customXml" ds:itemID="{3C440340-16A4-094A-8196-B83D8700B1E9}">
+<ds:datastoreItem xmlns:ds="http://schemas.openxmlformats.org/officeDocument/2006/customXml" ds:itemID="{DEEE1B77-05CC-E84A-A861-C8FFD449BDA5}">
   <ds:schemaRefs>
     <ds:schemaRef ds:uri="http://schemas.openxmlformats.org/officeDocument/2006/bibliography"/>
   </ds:schemaRefs>

</xml_diff>

<commit_message>
Updates the scenario document to reflect current version of spec. The scenario example contained an old attribute that was removed from the spec.
</commit_message>
<xml_diff>
--- a/scenarios/FastFedScenario_1A_with_SAML_and_SCIM.docx
+++ b/scenarios/FastFedScenario_1A_with_SAML_and_SCIM.docx
@@ -215,8 +215,6 @@
         </w:rPr>
         <w:t xml:space="preserve"> via Well-Known Subdomain</w:t>
       </w:r>
-      <w:bookmarkStart w:id="0" w:name="_GoBack"/>
-      <w:bookmarkEnd w:id="0"/>
     </w:p>
     <w:tbl>
       <w:tblPr>
@@ -2189,38 +2187,9 @@
           <w:numId w:val="8"/>
         </w:numPr>
       </w:pPr>
-      <w:r>
-        <w:rPr>
-          <w:rFonts w:ascii="Courier New" w:hAnsi="Courier New" w:cs="Courier New"/>
-          <w:noProof/>
-          <w:szCs w:val="22"/>
-        </w:rPr>
-        <w:t>state</w:t>
-      </w:r>
-      <w:r>
-        <w:rPr>
-          <w:rFonts w:ascii="Courier New" w:hAnsi="Courier New" w:cs="Courier New"/>
-          <w:noProof/>
-          <w:sz w:val="18"/>
-          <w:szCs w:val="18"/>
-        </w:rPr>
-        <w:t xml:space="preserve"> </w:t>
-      </w:r>
-      <w:r>
-        <w:t>is an opaque string where service providers may stash any context they wish to preserve with the flow</w:t>
-      </w:r>
-      <w:r>
-        <w:t>.</w:t>
-      </w:r>
-    </w:p>
-    <w:p>
-      <w:pPr>
-        <w:pStyle w:val="ListParagraph"/>
-        <w:numPr>
-          <w:ilvl w:val="0"/>
-          <w:numId w:val="8"/>
-        </w:numPr>
-      </w:pPr>
+      <w:bookmarkStart w:id="0" w:name="_GoBack"/>
+      <w:bookmarkEnd w:id="0"/>
+      <w:proofErr w:type="spellStart"/>
       <w:r>
         <w:rPr>
           <w:rFonts w:ascii="Courier New" w:hAnsi="Courier New" w:cs="Courier New"/>
@@ -2229,6 +2198,7 @@
         </w:rPr>
         <w:t>app_metadata_uri</w:t>
       </w:r>
+      <w:proofErr w:type="spellEnd"/>
       <w:r>
         <w:t xml:space="preserve"> informs the Identity Provider where to find the FastFed configuration for OnlineService.com</w:t>
       </w:r>
@@ -2609,82 +2579,82 @@
                 <w:sz w:val="18"/>
                 <w:szCs w:val="18"/>
               </w:rPr>
+              <w:t xml:space="preserve"> Content-Type: application/json</w:t>
+            </w:r>
+          </w:p>
+          <w:p>
+            <w:pPr>
+              <w:rPr>
+                <w:rFonts w:ascii="Courier New" w:hAnsi="Courier New" w:cs="Courier New"/>
+                <w:noProof/>
+                <w:sz w:val="18"/>
+                <w:szCs w:val="18"/>
+              </w:rPr>
+            </w:pPr>
+            <w:r>
+              <w:rPr>
+                <w:rFonts w:ascii="Courier New" w:hAnsi="Courier New" w:cs="Courier New"/>
+                <w:noProof/>
+                <w:sz w:val="18"/>
+                <w:szCs w:val="18"/>
+              </w:rPr>
+              <w:t xml:space="preserve"> {</w:t>
+            </w:r>
+          </w:p>
+          <w:p>
+            <w:pPr>
+              <w:rPr>
+                <w:rFonts w:ascii="Courier New" w:hAnsi="Courier New" w:cs="Courier New"/>
+                <w:noProof/>
+                <w:sz w:val="18"/>
+                <w:szCs w:val="18"/>
+              </w:rPr>
+            </w:pPr>
+            <w:r>
+              <w:rPr>
+                <w:rFonts w:ascii="Courier New" w:hAnsi="Courier New" w:cs="Courier New"/>
+                <w:noProof/>
+                <w:sz w:val="18"/>
+                <w:szCs w:val="18"/>
+              </w:rPr>
+              <w:t xml:space="preserve">   "</w:t>
+            </w:r>
+            <w:r>
+              <w:rPr>
+                <w:rFonts w:ascii="Courier New" w:hAnsi="Courier New" w:cs="Courier New"/>
+                <w:noProof/>
+                <w:sz w:val="18"/>
+                <w:szCs w:val="18"/>
+              </w:rPr>
+              <w:t>application</w:t>
+            </w:r>
+            <w:r>
+              <w:rPr>
+                <w:rFonts w:ascii="Courier New" w:hAnsi="Courier New" w:cs="Courier New"/>
+                <w:noProof/>
+                <w:sz w:val="18"/>
+                <w:szCs w:val="18"/>
+              </w:rPr>
+              <w:t>_provider": {</w:t>
+            </w:r>
+          </w:p>
+          <w:p>
+            <w:pPr>
+              <w:rPr>
+                <w:rFonts w:ascii="Courier New" w:hAnsi="Courier New" w:cs="Courier New"/>
+                <w:noProof/>
+                <w:sz w:val="18"/>
+                <w:szCs w:val="18"/>
+              </w:rPr>
+            </w:pPr>
+            <w:r>
+              <w:rPr>
+                <w:rFonts w:ascii="Courier New" w:hAnsi="Courier New" w:cs="Courier New"/>
+                <w:noProof/>
+                <w:sz w:val="18"/>
+                <w:szCs w:val="18"/>
+              </w:rPr>
               <w:lastRenderedPageBreak/>
-              <w:t xml:space="preserve"> Content-Type: application/json</w:t>
-            </w:r>
-          </w:p>
-          <w:p>
-            <w:pPr>
-              <w:rPr>
-                <w:rFonts w:ascii="Courier New" w:hAnsi="Courier New" w:cs="Courier New"/>
-                <w:noProof/>
-                <w:sz w:val="18"/>
-                <w:szCs w:val="18"/>
-              </w:rPr>
-            </w:pPr>
-            <w:r>
-              <w:rPr>
-                <w:rFonts w:ascii="Courier New" w:hAnsi="Courier New" w:cs="Courier New"/>
-                <w:noProof/>
-                <w:sz w:val="18"/>
-                <w:szCs w:val="18"/>
-              </w:rPr>
-              <w:t xml:space="preserve"> {</w:t>
-            </w:r>
-          </w:p>
-          <w:p>
-            <w:pPr>
-              <w:rPr>
-                <w:rFonts w:ascii="Courier New" w:hAnsi="Courier New" w:cs="Courier New"/>
-                <w:noProof/>
-                <w:sz w:val="18"/>
-                <w:szCs w:val="18"/>
-              </w:rPr>
-            </w:pPr>
-            <w:r>
-              <w:rPr>
-                <w:rFonts w:ascii="Courier New" w:hAnsi="Courier New" w:cs="Courier New"/>
-                <w:noProof/>
-                <w:sz w:val="18"/>
-                <w:szCs w:val="18"/>
-              </w:rPr>
-              <w:t xml:space="preserve">   "</w:t>
-            </w:r>
-            <w:r>
-              <w:rPr>
-                <w:rFonts w:ascii="Courier New" w:hAnsi="Courier New" w:cs="Courier New"/>
-                <w:noProof/>
-                <w:sz w:val="18"/>
-                <w:szCs w:val="18"/>
-              </w:rPr>
-              <w:t>application</w:t>
-            </w:r>
-            <w:r>
-              <w:rPr>
-                <w:rFonts w:ascii="Courier New" w:hAnsi="Courier New" w:cs="Courier New"/>
-                <w:noProof/>
-                <w:sz w:val="18"/>
-                <w:szCs w:val="18"/>
-              </w:rPr>
-              <w:t>_provider": {</w:t>
-            </w:r>
-          </w:p>
-          <w:p>
-            <w:pPr>
-              <w:rPr>
-                <w:rFonts w:ascii="Courier New" w:hAnsi="Courier New" w:cs="Courier New"/>
-                <w:noProof/>
-                <w:sz w:val="18"/>
-                <w:szCs w:val="18"/>
-              </w:rPr>
-            </w:pPr>
-            <w:r>
-              <w:rPr>
-                <w:rFonts w:ascii="Courier New" w:hAnsi="Courier New" w:cs="Courier New"/>
-                <w:noProof/>
-                <w:sz w:val="18"/>
-                <w:szCs w:val="18"/>
-              </w:rPr>
               <w:t xml:space="preserve">     "provider_</w:t>
             </w:r>
             <w:r>
@@ -3950,109 +3920,109 @@
                 <w:sz w:val="18"/>
                 <w:szCs w:val="18"/>
               </w:rPr>
+              <w:t xml:space="preserve">  "provisioning_profile</w:t>
+            </w:r>
+            <w:r>
+              <w:rPr>
+                <w:rFonts w:ascii="Courier New" w:hAnsi="Courier New" w:cs="Courier New"/>
+                <w:noProof/>
+                <w:sz w:val="18"/>
+                <w:szCs w:val="18"/>
+              </w:rPr>
+              <w:t>s</w:t>
+            </w:r>
+            <w:r>
+              <w:rPr>
+                <w:rFonts w:ascii="Courier New" w:hAnsi="Courier New" w:cs="Courier New"/>
+                <w:noProof/>
+                <w:sz w:val="18"/>
+                <w:szCs w:val="18"/>
+              </w:rPr>
+              <w:t>":</w:t>
+            </w:r>
+            <w:r>
+              <w:rPr>
+                <w:rFonts w:ascii="Courier New" w:hAnsi="Courier New" w:cs="Courier New"/>
+                <w:noProof/>
+                <w:sz w:val="18"/>
+                <w:szCs w:val="18"/>
+              </w:rPr>
+              <w:t xml:space="preserve"> [</w:t>
+            </w:r>
+          </w:p>
+          <w:p>
+            <w:pPr>
+              <w:rPr>
+                <w:rFonts w:ascii="Courier New" w:hAnsi="Courier New" w:cs="Courier New"/>
+                <w:noProof/>
+                <w:sz w:val="18"/>
+                <w:szCs w:val="18"/>
+              </w:rPr>
+            </w:pPr>
+            <w:r>
+              <w:rPr>
+                <w:rFonts w:ascii="Courier New" w:hAnsi="Courier New" w:cs="Courier New"/>
+                <w:noProof/>
+                <w:sz w:val="18"/>
+                <w:szCs w:val="18"/>
+              </w:rPr>
+              <w:t xml:space="preserve"> </w:t>
+            </w:r>
+            <w:r>
+              <w:rPr>
+                <w:rFonts w:ascii="Courier New" w:hAnsi="Courier New" w:cs="Courier New"/>
+                <w:noProof/>
+                <w:sz w:val="18"/>
+                <w:szCs w:val="18"/>
+              </w:rPr>
+              <w:t xml:space="preserve">   </w:t>
+            </w:r>
+            <w:r>
+              <w:rPr>
+                <w:rFonts w:ascii="Courier New" w:hAnsi="Courier New" w:cs="Courier New"/>
+                <w:noProof/>
+                <w:sz w:val="18"/>
+                <w:szCs w:val="18"/>
+              </w:rPr>
+              <w:t>"urn:ietf:params:fastfed:1.0:provisioning:SCIM:FullLifeCycle"</w:t>
+            </w:r>
+          </w:p>
+          <w:p>
+            <w:pPr>
+              <w:rPr>
+                <w:rFonts w:ascii="Courier New" w:hAnsi="Courier New" w:cs="Courier New"/>
+                <w:noProof/>
+                <w:sz w:val="18"/>
+                <w:szCs w:val="18"/>
+              </w:rPr>
+            </w:pPr>
+            <w:r>
+              <w:rPr>
+                <w:rFonts w:ascii="Courier New" w:hAnsi="Courier New" w:cs="Courier New"/>
+                <w:noProof/>
+                <w:sz w:val="18"/>
+                <w:szCs w:val="18"/>
+              </w:rPr>
+              <w:t xml:space="preserve">  ],</w:t>
+            </w:r>
+          </w:p>
+          <w:p>
+            <w:pPr>
+              <w:rPr>
+                <w:rFonts w:ascii="Courier New" w:hAnsi="Courier New" w:cs="Courier New"/>
+                <w:noProof/>
+                <w:sz w:val="18"/>
+                <w:szCs w:val="18"/>
+              </w:rPr>
+            </w:pPr>
+            <w:r>
+              <w:rPr>
+                <w:rFonts w:ascii="Courier New" w:hAnsi="Courier New" w:cs="Courier New"/>
+                <w:noProof/>
+                <w:sz w:val="18"/>
+                <w:szCs w:val="18"/>
+              </w:rPr>
               <w:lastRenderedPageBreak/>
-              <w:t xml:space="preserve">  "provisioning_profile</w:t>
-            </w:r>
-            <w:r>
-              <w:rPr>
-                <w:rFonts w:ascii="Courier New" w:hAnsi="Courier New" w:cs="Courier New"/>
-                <w:noProof/>
-                <w:sz w:val="18"/>
-                <w:szCs w:val="18"/>
-              </w:rPr>
-              <w:t>s</w:t>
-            </w:r>
-            <w:r>
-              <w:rPr>
-                <w:rFonts w:ascii="Courier New" w:hAnsi="Courier New" w:cs="Courier New"/>
-                <w:noProof/>
-                <w:sz w:val="18"/>
-                <w:szCs w:val="18"/>
-              </w:rPr>
-              <w:t>":</w:t>
-            </w:r>
-            <w:r>
-              <w:rPr>
-                <w:rFonts w:ascii="Courier New" w:hAnsi="Courier New" w:cs="Courier New"/>
-                <w:noProof/>
-                <w:sz w:val="18"/>
-                <w:szCs w:val="18"/>
-              </w:rPr>
-              <w:t xml:space="preserve"> [</w:t>
-            </w:r>
-          </w:p>
-          <w:p>
-            <w:pPr>
-              <w:rPr>
-                <w:rFonts w:ascii="Courier New" w:hAnsi="Courier New" w:cs="Courier New"/>
-                <w:noProof/>
-                <w:sz w:val="18"/>
-                <w:szCs w:val="18"/>
-              </w:rPr>
-            </w:pPr>
-            <w:r>
-              <w:rPr>
-                <w:rFonts w:ascii="Courier New" w:hAnsi="Courier New" w:cs="Courier New"/>
-                <w:noProof/>
-                <w:sz w:val="18"/>
-                <w:szCs w:val="18"/>
-              </w:rPr>
-              <w:t xml:space="preserve"> </w:t>
-            </w:r>
-            <w:r>
-              <w:rPr>
-                <w:rFonts w:ascii="Courier New" w:hAnsi="Courier New" w:cs="Courier New"/>
-                <w:noProof/>
-                <w:sz w:val="18"/>
-                <w:szCs w:val="18"/>
-              </w:rPr>
-              <w:t xml:space="preserve">   </w:t>
-            </w:r>
-            <w:r>
-              <w:rPr>
-                <w:rFonts w:ascii="Courier New" w:hAnsi="Courier New" w:cs="Courier New"/>
-                <w:noProof/>
-                <w:sz w:val="18"/>
-                <w:szCs w:val="18"/>
-              </w:rPr>
-              <w:t>"urn:ietf:params:fastfed:1.0:provisioning:SCIM:FullLifeCycle"</w:t>
-            </w:r>
-          </w:p>
-          <w:p>
-            <w:pPr>
-              <w:rPr>
-                <w:rFonts w:ascii="Courier New" w:hAnsi="Courier New" w:cs="Courier New"/>
-                <w:noProof/>
-                <w:sz w:val="18"/>
-                <w:szCs w:val="18"/>
-              </w:rPr>
-            </w:pPr>
-            <w:r>
-              <w:rPr>
-                <w:rFonts w:ascii="Courier New" w:hAnsi="Courier New" w:cs="Courier New"/>
-                <w:noProof/>
-                <w:sz w:val="18"/>
-                <w:szCs w:val="18"/>
-              </w:rPr>
-              <w:t xml:space="preserve">  ],</w:t>
-            </w:r>
-          </w:p>
-          <w:p>
-            <w:pPr>
-              <w:rPr>
-                <w:rFonts w:ascii="Courier New" w:hAnsi="Courier New" w:cs="Courier New"/>
-                <w:noProof/>
-                <w:sz w:val="18"/>
-                <w:szCs w:val="18"/>
-              </w:rPr>
-            </w:pPr>
-            <w:r>
-              <w:rPr>
-                <w:rFonts w:ascii="Courier New" w:hAnsi="Courier New" w:cs="Courier New"/>
-                <w:noProof/>
-                <w:sz w:val="18"/>
-                <w:szCs w:val="18"/>
-              </w:rPr>
               <w:t xml:space="preserve">  </w:t>
             </w:r>
             <w:r>
@@ -5339,64 +5309,64 @@
                 <w:sz w:val="18"/>
                 <w:szCs w:val="18"/>
               </w:rPr>
+              <w:t xml:space="preserve">   "oauth_token": {</w:t>
+            </w:r>
+          </w:p>
+          <w:p>
+            <w:pPr>
+              <w:rPr>
+                <w:rFonts w:ascii="Courier New" w:hAnsi="Courier New" w:cs="Courier New"/>
+                <w:noProof/>
+                <w:sz w:val="18"/>
+                <w:szCs w:val="18"/>
+              </w:rPr>
+            </w:pPr>
+            <w:r>
+              <w:rPr>
+                <w:rFonts w:ascii="Courier New" w:hAnsi="Courier New" w:cs="Courier New"/>
+                <w:noProof/>
+                <w:sz w:val="18"/>
+                <w:szCs w:val="18"/>
+              </w:rPr>
+              <w:t xml:space="preserve">     "access_token": "MTQ0NjJkZmQ5OTM2NDE1ZTZjNGZmZjI3",</w:t>
+            </w:r>
+          </w:p>
+          <w:p>
+            <w:pPr>
+              <w:rPr>
+                <w:rFonts w:ascii="Courier New" w:hAnsi="Courier New" w:cs="Courier New"/>
+                <w:noProof/>
+                <w:sz w:val="18"/>
+                <w:szCs w:val="18"/>
+              </w:rPr>
+            </w:pPr>
+            <w:r>
+              <w:rPr>
+                <w:rFonts w:ascii="Courier New" w:hAnsi="Courier New" w:cs="Courier New"/>
+                <w:noProof/>
+                <w:sz w:val="18"/>
+                <w:szCs w:val="18"/>
+              </w:rPr>
+              <w:t xml:space="preserve">     "token_type": "bearer",</w:t>
+            </w:r>
+          </w:p>
+          <w:p>
+            <w:pPr>
+              <w:rPr>
+                <w:rFonts w:ascii="Courier New" w:hAnsi="Courier New" w:cs="Courier New"/>
+                <w:noProof/>
+                <w:sz w:val="18"/>
+                <w:szCs w:val="18"/>
+              </w:rPr>
+            </w:pPr>
+            <w:r>
+              <w:rPr>
+                <w:rFonts w:ascii="Courier New" w:hAnsi="Courier New" w:cs="Courier New"/>
+                <w:noProof/>
+                <w:sz w:val="18"/>
+                <w:szCs w:val="18"/>
+              </w:rPr>
               <w:lastRenderedPageBreak/>
-              <w:t xml:space="preserve">   "oauth_token": {</w:t>
-            </w:r>
-          </w:p>
-          <w:p>
-            <w:pPr>
-              <w:rPr>
-                <w:rFonts w:ascii="Courier New" w:hAnsi="Courier New" w:cs="Courier New"/>
-                <w:noProof/>
-                <w:sz w:val="18"/>
-                <w:szCs w:val="18"/>
-              </w:rPr>
-            </w:pPr>
-            <w:r>
-              <w:rPr>
-                <w:rFonts w:ascii="Courier New" w:hAnsi="Courier New" w:cs="Courier New"/>
-                <w:noProof/>
-                <w:sz w:val="18"/>
-                <w:szCs w:val="18"/>
-              </w:rPr>
-              <w:t xml:space="preserve">     "access_token": "MTQ0NjJkZmQ5OTM2NDE1ZTZjNGZmZjI3",</w:t>
-            </w:r>
-          </w:p>
-          <w:p>
-            <w:pPr>
-              <w:rPr>
-                <w:rFonts w:ascii="Courier New" w:hAnsi="Courier New" w:cs="Courier New"/>
-                <w:noProof/>
-                <w:sz w:val="18"/>
-                <w:szCs w:val="18"/>
-              </w:rPr>
-            </w:pPr>
-            <w:r>
-              <w:rPr>
-                <w:rFonts w:ascii="Courier New" w:hAnsi="Courier New" w:cs="Courier New"/>
-                <w:noProof/>
-                <w:sz w:val="18"/>
-                <w:szCs w:val="18"/>
-              </w:rPr>
-              <w:t xml:space="preserve">     "token_type": "bearer",</w:t>
-            </w:r>
-          </w:p>
-          <w:p>
-            <w:pPr>
-              <w:rPr>
-                <w:rFonts w:ascii="Courier New" w:hAnsi="Courier New" w:cs="Courier New"/>
-                <w:noProof/>
-                <w:sz w:val="18"/>
-                <w:szCs w:val="18"/>
-              </w:rPr>
-            </w:pPr>
-            <w:r>
-              <w:rPr>
-                <w:rFonts w:ascii="Courier New" w:hAnsi="Courier New" w:cs="Courier New"/>
-                <w:noProof/>
-                <w:sz w:val="18"/>
-                <w:szCs w:val="18"/>
-              </w:rPr>
               <w:t xml:space="preserve">     "refresh_token": "IwOGYzYTlmM2YxOTQ5MGE3YmNmMDFkNTVk",</w:t>
             </w:r>
           </w:p>
@@ -7428,7 +7398,7 @@
 </file>
 
 <file path=customXml/itemProps1.xml><?xml version="1.0" encoding="utf-8"?>
-<ds:datastoreItem xmlns:ds="http://schemas.openxmlformats.org/officeDocument/2006/customXml" ds:itemID="{E680C411-2F8F-4748-A637-88CE9F16BB56}">
+<ds:datastoreItem xmlns:ds="http://schemas.openxmlformats.org/officeDocument/2006/customXml" ds:itemID="{72B8B337-6DD4-BA41-B7D7-9CF4625037C7}">
   <ds:schemaRefs>
     <ds:schemaRef ds:uri="http://schemas.openxmlformats.org/officeDocument/2006/bibliography"/>
   </ds:schemaRefs>

</xml_diff>

<commit_message>
New SCIM interop profile. Desired_attributes are now expressed for each individual profile..
</commit_message>
<xml_diff>
--- a/scenarios/FastFedScenario_1A_with_SAML_and_SCIM.docx
+++ b/scenarios/FastFedScenario_1A_with_SAML_and_SCIM.docx
@@ -1008,7 +1008,15 @@
         <w:t>’s</w:t>
       </w:r>
       <w:r>
-        <w:t>”) and can procceed.</w:t>
+        <w:t xml:space="preserve">”) and can </w:t>
+      </w:r>
+      <w:proofErr w:type="spellStart"/>
+      <w:r>
+        <w:t>procceed</w:t>
+      </w:r>
+      <w:proofErr w:type="spellEnd"/>
+      <w:r>
+        <w:t>.</w:t>
       </w:r>
     </w:p>
     <w:p/>
@@ -1776,7 +1784,25 @@
                 <w:sz w:val="18"/>
                 <w:szCs w:val="18"/>
               </w:rPr>
-              <w:t xml:space="preserve">         "urn:ietf:params:fastfed:1.0:authentication:SAML:Basic"</w:t>
+              <w:t xml:space="preserve">         "urn:ietf:params:fastfed:1.0:authentication:</w:t>
+            </w:r>
+            <w:r>
+              <w:rPr>
+                <w:rFonts w:ascii="Courier New" w:hAnsi="Courier New" w:cs="Courier New"/>
+                <w:noProof/>
+                <w:sz w:val="18"/>
+                <w:szCs w:val="18"/>
+              </w:rPr>
+              <w:t>saml:2.0:basic</w:t>
+            </w:r>
+            <w:r>
+              <w:rPr>
+                <w:rFonts w:ascii="Courier New" w:hAnsi="Courier New" w:cs="Courier New"/>
+                <w:noProof/>
+                <w:sz w:val="18"/>
+                <w:szCs w:val="18"/>
+              </w:rPr>
+              <w:t>"</w:t>
             </w:r>
           </w:p>
           <w:p>
@@ -1833,7 +1859,25 @@
                 <w:sz w:val="18"/>
                 <w:szCs w:val="18"/>
               </w:rPr>
-              <w:t xml:space="preserve">         "urn:ietf:params:fastfed:1.0:provisioning:SCIM:FullLifeCycle"</w:t>
+              <w:t xml:space="preserve">         "urn:ietf:params:fastfed:1.0:provisioning:</w:t>
+            </w:r>
+            <w:r>
+              <w:rPr>
+                <w:rFonts w:ascii="Courier New" w:hAnsi="Courier New" w:cs="Courier New"/>
+                <w:noProof/>
+                <w:sz w:val="18"/>
+                <w:szCs w:val="18"/>
+              </w:rPr>
+              <w:t>scim:2.0:basic</w:t>
+            </w:r>
+            <w:r>
+              <w:rPr>
+                <w:rFonts w:ascii="Courier New" w:hAnsi="Courier New" w:cs="Courier New"/>
+                <w:noProof/>
+                <w:sz w:val="18"/>
+                <w:szCs w:val="18"/>
+              </w:rPr>
+              <w:t>"</w:t>
             </w:r>
           </w:p>
           <w:p>
@@ -2205,7 +2249,15 @@
     <w:p/>
     <w:p>
       <w:r>
-        <w:t>For example, if the discovery process located multiple valid Identity Providers, Alice may be shown the list of Providers and their capabilties and asked to select one before continuing.</w:t>
+        <w:t xml:space="preserve">For example, if the discovery process located multiple valid Identity Providers, Alice may be shown the list of Providers and their </w:t>
+      </w:r>
+      <w:proofErr w:type="spellStart"/>
+      <w:r>
+        <w:t>capabilties</w:t>
+      </w:r>
+      <w:proofErr w:type="spellEnd"/>
+      <w:r>
+        <w:t xml:space="preserve"> and asked to select one before continuing.</w:t>
       </w:r>
     </w:p>
     <w:p/>
@@ -2243,9 +2295,11 @@
       <w:r>
         <w:t xml:space="preserve">Finally, Alice will be </w:t>
       </w:r>
+      <w:proofErr w:type="spellStart"/>
       <w:r>
         <w:t>prompoted</w:t>
       </w:r>
+      <w:proofErr w:type="spellEnd"/>
       <w:r>
         <w:t xml:space="preserve"> to confirm</w:t>
       </w:r>
@@ -3029,13 +3083,10 @@
         <w:t xml:space="preserve">If Alice DOES NOT have permissions, she may </w:t>
       </w:r>
       <w:r>
-        <w:t xml:space="preserve">be required at any point beyond this </w:t>
-      </w:r>
-      <w:r>
-        <w:t>point</w:t>
-      </w:r>
-      <w:r>
-        <w:t xml:space="preserve"> to enqueue the request to her local IT team for </w:t>
+        <w:t xml:space="preserve">be required at any point </w:t>
+      </w:r>
+      <w:r>
+        <w:t xml:space="preserve">to enqueue the request to her local IT team for </w:t>
       </w:r>
       <w:r>
         <w:t>approval. The</w:t>
@@ -3189,7 +3240,15 @@
     <w:p/>
     <w:p>
       <w:r>
-        <w:t>The Identity Provider reads the metadata, validates compatibiilty, checks for duplicates, and determines whether proceeding would result in the creation of a new federation relationship or updates to an existing relationship.</w:t>
+        <w:t xml:space="preserve">The Identity Provider reads the metadata, validates </w:t>
+      </w:r>
+      <w:proofErr w:type="spellStart"/>
+      <w:r>
+        <w:t>compatibiilty</w:t>
+      </w:r>
+      <w:proofErr w:type="spellEnd"/>
+      <w:r>
+        <w:t>, checks for duplicates, and determines whether proceeding would result in the creation of a new federation relationship or updates to an existing relationship.</w:t>
       </w:r>
     </w:p>
     <w:p/>
@@ -3767,45 +3826,82 @@
                 <w:sz w:val="18"/>
                 <w:szCs w:val="18"/>
               </w:rPr>
+              <w:t xml:space="preserve">       "display_name": "Example </w:t>
+            </w:r>
+            <w:r>
+              <w:rPr>
+                <w:rFonts w:ascii="Courier New" w:hAnsi="Courier New" w:cs="Courier New"/>
+                <w:noProof/>
+                <w:sz w:val="18"/>
+                <w:szCs w:val="18"/>
+              </w:rPr>
+              <w:t>Service</w:t>
+            </w:r>
+            <w:r>
+              <w:rPr>
+                <w:rFonts w:ascii="Courier New" w:hAnsi="Courier New" w:cs="Courier New"/>
+                <w:noProof/>
+                <w:sz w:val="18"/>
+                <w:szCs w:val="18"/>
+              </w:rPr>
+              <w:t xml:space="preserve"> Provider",</w:t>
+            </w:r>
+          </w:p>
+          <w:p>
+            <w:pPr>
+              <w:rPr>
+                <w:rFonts w:ascii="Courier New" w:hAnsi="Courier New" w:cs="Courier New"/>
+                <w:noProof/>
+                <w:sz w:val="18"/>
+                <w:szCs w:val="18"/>
+              </w:rPr>
+            </w:pPr>
+            <w:r>
+              <w:rPr>
+                <w:rFonts w:ascii="Courier New" w:hAnsi="Courier New" w:cs="Courier New"/>
+                <w:noProof/>
+                <w:sz w:val="18"/>
+                <w:szCs w:val="18"/>
+              </w:rPr>
+              <w:t xml:space="preserve">       "logo_uri": "https://</w:t>
+            </w:r>
+            <w:r>
+              <w:rPr>
+                <w:rFonts w:ascii="Courier New" w:hAnsi="Courier New" w:cs="Courier New"/>
+                <w:noProof/>
+                <w:sz w:val="18"/>
+                <w:szCs w:val="18"/>
+              </w:rPr>
+              <w:t>onlineservice</w:t>
+            </w:r>
+            <w:r>
+              <w:rPr>
+                <w:rFonts w:ascii="Courier New" w:hAnsi="Courier New" w:cs="Courier New"/>
+                <w:noProof/>
+                <w:sz w:val="18"/>
+                <w:szCs w:val="18"/>
+              </w:rPr>
+              <w:t>.com/images/logo.png",</w:t>
+            </w:r>
+          </w:p>
+          <w:p>
+            <w:pPr>
+              <w:rPr>
+                <w:rFonts w:ascii="Courier New" w:hAnsi="Courier New" w:cs="Courier New"/>
+                <w:noProof/>
+                <w:sz w:val="18"/>
+                <w:szCs w:val="18"/>
+              </w:rPr>
+            </w:pPr>
+            <w:r>
+              <w:rPr>
+                <w:rFonts w:ascii="Courier New" w:hAnsi="Courier New" w:cs="Courier New"/>
+                <w:noProof/>
+                <w:sz w:val="18"/>
+                <w:szCs w:val="18"/>
+              </w:rPr>
               <w:lastRenderedPageBreak/>
-              <w:t xml:space="preserve">       "display_name": "Example </w:t>
-            </w:r>
-            <w:r>
-              <w:rPr>
-                <w:rFonts w:ascii="Courier New" w:hAnsi="Courier New" w:cs="Courier New"/>
-                <w:noProof/>
-                <w:sz w:val="18"/>
-                <w:szCs w:val="18"/>
-              </w:rPr>
-              <w:t>Service</w:t>
-            </w:r>
-            <w:r>
-              <w:rPr>
-                <w:rFonts w:ascii="Courier New" w:hAnsi="Courier New" w:cs="Courier New"/>
-                <w:noProof/>
-                <w:sz w:val="18"/>
-                <w:szCs w:val="18"/>
-              </w:rPr>
-              <w:t xml:space="preserve"> Provider",</w:t>
-            </w:r>
-          </w:p>
-          <w:p>
-            <w:pPr>
-              <w:rPr>
-                <w:rFonts w:ascii="Courier New" w:hAnsi="Courier New" w:cs="Courier New"/>
-                <w:noProof/>
-                <w:sz w:val="18"/>
-                <w:szCs w:val="18"/>
-              </w:rPr>
-            </w:pPr>
-            <w:r>
-              <w:rPr>
-                <w:rFonts w:ascii="Courier New" w:hAnsi="Courier New" w:cs="Courier New"/>
-                <w:noProof/>
-                <w:sz w:val="18"/>
-                <w:szCs w:val="18"/>
-              </w:rPr>
-              <w:t xml:space="preserve">       "logo_uri": "https://</w:t>
+              <w:t xml:space="preserve">       "icon_uri": "https://</w:t>
             </w:r>
             <w:r>
               <w:rPr>
@@ -3823,26 +3919,413 @@
                 <w:sz w:val="18"/>
                 <w:szCs w:val="18"/>
               </w:rPr>
-              <w:t>.com/images/logo.png",</w:t>
-            </w:r>
-          </w:p>
-          <w:p>
-            <w:pPr>
-              <w:rPr>
-                <w:rFonts w:ascii="Courier New" w:hAnsi="Courier New" w:cs="Courier New"/>
-                <w:noProof/>
-                <w:sz w:val="18"/>
-                <w:szCs w:val="18"/>
-              </w:rPr>
-            </w:pPr>
-            <w:r>
-              <w:rPr>
-                <w:rFonts w:ascii="Courier New" w:hAnsi="Courier New" w:cs="Courier New"/>
-                <w:noProof/>
-                <w:sz w:val="18"/>
-                <w:szCs w:val="18"/>
-              </w:rPr>
-              <w:t xml:space="preserve">       "icon_uri": "https://</w:t>
+              <w:t>.com/images/icon.png",</w:t>
+            </w:r>
+          </w:p>
+          <w:p>
+            <w:pPr>
+              <w:rPr>
+                <w:rFonts w:ascii="Courier New" w:hAnsi="Courier New" w:cs="Courier New"/>
+                <w:noProof/>
+                <w:sz w:val="18"/>
+                <w:szCs w:val="18"/>
+              </w:rPr>
+            </w:pPr>
+            <w:r>
+              <w:rPr>
+                <w:rFonts w:ascii="Courier New" w:hAnsi="Courier New" w:cs="Courier New"/>
+                <w:noProof/>
+                <w:sz w:val="18"/>
+                <w:szCs w:val="18"/>
+              </w:rPr>
+              <w:t xml:space="preserve">       "license": "https://openid.net/intellectual-property/licenses/fastfed/1.0/"</w:t>
+            </w:r>
+          </w:p>
+          <w:p>
+            <w:pPr>
+              <w:rPr>
+                <w:rFonts w:ascii="Courier New" w:hAnsi="Courier New" w:cs="Courier New"/>
+                <w:noProof/>
+                <w:sz w:val="18"/>
+                <w:szCs w:val="18"/>
+              </w:rPr>
+            </w:pPr>
+            <w:r>
+              <w:rPr>
+                <w:rFonts w:ascii="Courier New" w:hAnsi="Courier New" w:cs="Courier New"/>
+                <w:noProof/>
+                <w:sz w:val="18"/>
+                <w:szCs w:val="18"/>
+              </w:rPr>
+              <w:t xml:space="preserve">     }</w:t>
+            </w:r>
+          </w:p>
+          <w:p>
+            <w:pPr>
+              <w:rPr>
+                <w:rFonts w:ascii="Courier New" w:hAnsi="Courier New" w:cs="Courier New"/>
+                <w:noProof/>
+                <w:sz w:val="18"/>
+                <w:szCs w:val="18"/>
+              </w:rPr>
+            </w:pPr>
+            <w:r>
+              <w:rPr>
+                <w:rFonts w:ascii="Courier New" w:hAnsi="Courier New" w:cs="Courier New"/>
+                <w:noProof/>
+                <w:sz w:val="18"/>
+                <w:szCs w:val="18"/>
+              </w:rPr>
+              <w:t xml:space="preserve">     "capabilities": {</w:t>
+            </w:r>
+          </w:p>
+          <w:p>
+            <w:pPr>
+              <w:rPr>
+                <w:rFonts w:ascii="Courier New" w:hAnsi="Courier New" w:cs="Courier New"/>
+                <w:noProof/>
+                <w:sz w:val="18"/>
+                <w:szCs w:val="18"/>
+              </w:rPr>
+            </w:pPr>
+            <w:r>
+              <w:rPr>
+                <w:rFonts w:ascii="Courier New" w:hAnsi="Courier New" w:cs="Courier New"/>
+                <w:noProof/>
+                <w:sz w:val="18"/>
+                <w:szCs w:val="18"/>
+              </w:rPr>
+              <w:t xml:space="preserve">       "authentication_profiles": [</w:t>
+            </w:r>
+          </w:p>
+          <w:p>
+            <w:pPr>
+              <w:rPr>
+                <w:rFonts w:ascii="Courier New" w:hAnsi="Courier New" w:cs="Courier New"/>
+                <w:noProof/>
+                <w:sz w:val="18"/>
+                <w:szCs w:val="18"/>
+              </w:rPr>
+            </w:pPr>
+            <w:r>
+              <w:rPr>
+                <w:rFonts w:ascii="Courier New" w:hAnsi="Courier New" w:cs="Courier New"/>
+                <w:noProof/>
+                <w:sz w:val="18"/>
+                <w:szCs w:val="18"/>
+              </w:rPr>
+              <w:t xml:space="preserve">         "urn:ietf:params:fastfed:1.0:authentication:</w:t>
+            </w:r>
+            <w:r>
+              <w:rPr>
+                <w:rFonts w:ascii="Courier New" w:hAnsi="Courier New" w:cs="Courier New"/>
+                <w:noProof/>
+                <w:sz w:val="18"/>
+                <w:szCs w:val="18"/>
+              </w:rPr>
+              <w:t>saml:2.0:basic</w:t>
+            </w:r>
+            <w:r>
+              <w:rPr>
+                <w:rFonts w:ascii="Courier New" w:hAnsi="Courier New" w:cs="Courier New"/>
+                <w:noProof/>
+                <w:sz w:val="18"/>
+                <w:szCs w:val="18"/>
+              </w:rPr>
+              <w:t>"</w:t>
+            </w:r>
+          </w:p>
+          <w:p>
+            <w:pPr>
+              <w:rPr>
+                <w:rFonts w:ascii="Courier New" w:hAnsi="Courier New" w:cs="Courier New"/>
+                <w:noProof/>
+                <w:sz w:val="18"/>
+                <w:szCs w:val="18"/>
+              </w:rPr>
+            </w:pPr>
+            <w:r>
+              <w:rPr>
+                <w:rFonts w:ascii="Courier New" w:hAnsi="Courier New" w:cs="Courier New"/>
+                <w:noProof/>
+                <w:sz w:val="18"/>
+                <w:szCs w:val="18"/>
+              </w:rPr>
+              <w:t xml:space="preserve">       ],</w:t>
+            </w:r>
+          </w:p>
+          <w:p>
+            <w:pPr>
+              <w:rPr>
+                <w:rFonts w:ascii="Courier New" w:hAnsi="Courier New" w:cs="Courier New"/>
+                <w:noProof/>
+                <w:sz w:val="18"/>
+                <w:szCs w:val="18"/>
+              </w:rPr>
+            </w:pPr>
+            <w:r>
+              <w:rPr>
+                <w:rFonts w:ascii="Courier New" w:hAnsi="Courier New" w:cs="Courier New"/>
+                <w:noProof/>
+                <w:sz w:val="18"/>
+                <w:szCs w:val="18"/>
+              </w:rPr>
+              <w:t xml:space="preserve">       "provisioning_profiles": [</w:t>
+            </w:r>
+          </w:p>
+          <w:p>
+            <w:pPr>
+              <w:rPr>
+                <w:rFonts w:ascii="Courier New" w:hAnsi="Courier New" w:cs="Courier New"/>
+                <w:noProof/>
+                <w:sz w:val="18"/>
+                <w:szCs w:val="18"/>
+              </w:rPr>
+            </w:pPr>
+            <w:r>
+              <w:rPr>
+                <w:rFonts w:ascii="Courier New" w:hAnsi="Courier New" w:cs="Courier New"/>
+                <w:noProof/>
+                <w:sz w:val="18"/>
+                <w:szCs w:val="18"/>
+              </w:rPr>
+              <w:t xml:space="preserve">         "urn:ietf:params:fastfed:1.0:provisioning:</w:t>
+            </w:r>
+            <w:r>
+              <w:rPr>
+                <w:rFonts w:ascii="Courier New" w:hAnsi="Courier New" w:cs="Courier New"/>
+                <w:noProof/>
+                <w:sz w:val="18"/>
+                <w:szCs w:val="18"/>
+              </w:rPr>
+              <w:t>scim:2.0:basic</w:t>
+            </w:r>
+            <w:r>
+              <w:rPr>
+                <w:rFonts w:ascii="Courier New" w:hAnsi="Courier New" w:cs="Courier New"/>
+                <w:noProof/>
+                <w:sz w:val="18"/>
+                <w:szCs w:val="18"/>
+              </w:rPr>
+              <w:t>"</w:t>
+            </w:r>
+          </w:p>
+          <w:p>
+            <w:pPr>
+              <w:rPr>
+                <w:rFonts w:ascii="Courier New" w:hAnsi="Courier New" w:cs="Courier New"/>
+                <w:noProof/>
+                <w:sz w:val="18"/>
+                <w:szCs w:val="18"/>
+              </w:rPr>
+            </w:pPr>
+            <w:r>
+              <w:rPr>
+                <w:rFonts w:ascii="Courier New" w:hAnsi="Courier New" w:cs="Courier New"/>
+                <w:noProof/>
+                <w:sz w:val="18"/>
+                <w:szCs w:val="18"/>
+              </w:rPr>
+              <w:t xml:space="preserve">       ],</w:t>
+            </w:r>
+          </w:p>
+          <w:p>
+            <w:pPr>
+              <w:rPr>
+                <w:rFonts w:ascii="Courier New" w:hAnsi="Courier New" w:cs="Courier New"/>
+                <w:noProof/>
+                <w:sz w:val="18"/>
+                <w:szCs w:val="18"/>
+              </w:rPr>
+            </w:pPr>
+            <w:r>
+              <w:rPr>
+                <w:rFonts w:ascii="Courier New" w:hAnsi="Courier New" w:cs="Courier New"/>
+                <w:noProof/>
+                <w:sz w:val="18"/>
+                <w:szCs w:val="18"/>
+              </w:rPr>
+              <w:t xml:space="preserve">       "schema_grammars": [</w:t>
+            </w:r>
+          </w:p>
+          <w:p>
+            <w:pPr>
+              <w:rPr>
+                <w:rFonts w:ascii="Courier New" w:hAnsi="Courier New" w:cs="Courier New"/>
+                <w:noProof/>
+                <w:sz w:val="18"/>
+                <w:szCs w:val="18"/>
+              </w:rPr>
+            </w:pPr>
+            <w:r>
+              <w:rPr>
+                <w:rFonts w:ascii="Courier New" w:hAnsi="Courier New" w:cs="Courier New"/>
+                <w:noProof/>
+                <w:sz w:val="18"/>
+                <w:szCs w:val="18"/>
+              </w:rPr>
+              <w:t xml:space="preserve">         "urn:ietf:params:fastfed:1:0:schemas:scim:2.0"</w:t>
+            </w:r>
+          </w:p>
+          <w:p>
+            <w:pPr>
+              <w:rPr>
+                <w:rFonts w:ascii="Courier New" w:hAnsi="Courier New" w:cs="Courier New"/>
+                <w:noProof/>
+                <w:sz w:val="18"/>
+                <w:szCs w:val="18"/>
+              </w:rPr>
+            </w:pPr>
+            <w:r>
+              <w:rPr>
+                <w:rFonts w:ascii="Courier New" w:hAnsi="Courier New" w:cs="Courier New"/>
+                <w:noProof/>
+                <w:sz w:val="18"/>
+                <w:szCs w:val="18"/>
+              </w:rPr>
+              <w:t xml:space="preserve">       ],</w:t>
+            </w:r>
+          </w:p>
+          <w:p>
+            <w:pPr>
+              <w:rPr>
+                <w:rFonts w:ascii="Courier New" w:hAnsi="Courier New" w:cs="Courier New"/>
+                <w:noProof/>
+                <w:sz w:val="18"/>
+                <w:szCs w:val="18"/>
+              </w:rPr>
+            </w:pPr>
+            <w:r>
+              <w:rPr>
+                <w:rFonts w:ascii="Courier New" w:hAnsi="Courier New" w:cs="Courier New"/>
+                <w:noProof/>
+                <w:sz w:val="18"/>
+                <w:szCs w:val="18"/>
+              </w:rPr>
+              <w:t xml:space="preserve">       "signing_alg_values_supported": [</w:t>
+            </w:r>
+          </w:p>
+          <w:p>
+            <w:pPr>
+              <w:rPr>
+                <w:rFonts w:ascii="Courier New" w:hAnsi="Courier New" w:cs="Courier New"/>
+                <w:noProof/>
+                <w:sz w:val="18"/>
+                <w:szCs w:val="18"/>
+              </w:rPr>
+            </w:pPr>
+            <w:r>
+              <w:rPr>
+                <w:rFonts w:ascii="Courier New" w:hAnsi="Courier New" w:cs="Courier New"/>
+                <w:noProof/>
+                <w:sz w:val="18"/>
+                <w:szCs w:val="18"/>
+              </w:rPr>
+              <w:t xml:space="preserve">         "ES512",</w:t>
+            </w:r>
+          </w:p>
+          <w:p>
+            <w:pPr>
+              <w:rPr>
+                <w:rFonts w:ascii="Courier New" w:hAnsi="Courier New" w:cs="Courier New"/>
+                <w:noProof/>
+                <w:sz w:val="18"/>
+                <w:szCs w:val="18"/>
+              </w:rPr>
+            </w:pPr>
+            <w:r>
+              <w:rPr>
+                <w:rFonts w:ascii="Courier New" w:hAnsi="Courier New" w:cs="Courier New"/>
+                <w:noProof/>
+                <w:sz w:val="18"/>
+                <w:szCs w:val="18"/>
+              </w:rPr>
+              <w:t xml:space="preserve">         "RS256"</w:t>
+            </w:r>
+          </w:p>
+          <w:p>
+            <w:pPr>
+              <w:rPr>
+                <w:rFonts w:ascii="Courier New" w:hAnsi="Courier New" w:cs="Courier New"/>
+                <w:noProof/>
+                <w:sz w:val="18"/>
+                <w:szCs w:val="18"/>
+              </w:rPr>
+            </w:pPr>
+            <w:r>
+              <w:rPr>
+                <w:rFonts w:ascii="Courier New" w:hAnsi="Courier New" w:cs="Courier New"/>
+                <w:noProof/>
+                <w:sz w:val="18"/>
+                <w:szCs w:val="18"/>
+              </w:rPr>
+              <w:t xml:space="preserve">       ]</w:t>
+            </w:r>
+          </w:p>
+          <w:p>
+            <w:pPr>
+              <w:rPr>
+                <w:rFonts w:ascii="Courier New" w:hAnsi="Courier New" w:cs="Courier New"/>
+                <w:noProof/>
+                <w:sz w:val="18"/>
+                <w:szCs w:val="18"/>
+              </w:rPr>
+            </w:pPr>
+            <w:r>
+              <w:rPr>
+                <w:rFonts w:ascii="Courier New" w:hAnsi="Courier New" w:cs="Courier New"/>
+                <w:noProof/>
+                <w:sz w:val="18"/>
+                <w:szCs w:val="18"/>
+              </w:rPr>
+              <w:t xml:space="preserve">     },</w:t>
+            </w:r>
+          </w:p>
+          <w:p>
+            <w:pPr>
+              <w:rPr>
+                <w:rFonts w:ascii="Courier New" w:hAnsi="Courier New" w:cs="Courier New"/>
+                <w:noProof/>
+                <w:sz w:val="18"/>
+                <w:szCs w:val="18"/>
+              </w:rPr>
+            </w:pPr>
+            <w:r>
+              <w:rPr>
+                <w:rFonts w:ascii="Courier New" w:hAnsi="Courier New" w:cs="Courier New"/>
+                <w:noProof/>
+                <w:sz w:val="18"/>
+                <w:szCs w:val="18"/>
+              </w:rPr>
+              <w:t xml:space="preserve">     "fastfed_handshake_register_uri": </w:t>
+            </w:r>
+          </w:p>
+          <w:p>
+            <w:pPr>
+              <w:rPr>
+                <w:rFonts w:ascii="Courier New" w:hAnsi="Courier New" w:cs="Courier New"/>
+                <w:noProof/>
+                <w:sz w:val="18"/>
+                <w:szCs w:val="18"/>
+              </w:rPr>
+            </w:pPr>
+            <w:r>
+              <w:rPr>
+                <w:rFonts w:ascii="Courier New" w:hAnsi="Courier New" w:cs="Courier New"/>
+                <w:noProof/>
+                <w:sz w:val="18"/>
+                <w:szCs w:val="18"/>
+              </w:rPr>
+              <w:t xml:space="preserve">       </w:t>
+            </w:r>
+            <w:r>
+              <w:rPr>
+                <w:rFonts w:ascii="Courier New" w:hAnsi="Courier New" w:cs="Courier New"/>
+                <w:noProof/>
+                <w:sz w:val="18"/>
+                <w:szCs w:val="18"/>
+              </w:rPr>
+              <w:t>"https://tenant-67890.</w:t>
             </w:r>
             <w:r>
               <w:rPr>
@@ -3860,26 +4343,765 @@
                 <w:sz w:val="18"/>
                 <w:szCs w:val="18"/>
               </w:rPr>
-              <w:t>.com/images/icon.png",</w:t>
-            </w:r>
-          </w:p>
-          <w:p>
-            <w:pPr>
-              <w:rPr>
-                <w:rFonts w:ascii="Courier New" w:hAnsi="Courier New" w:cs="Courier New"/>
-                <w:noProof/>
-                <w:sz w:val="18"/>
-                <w:szCs w:val="18"/>
-              </w:rPr>
-            </w:pPr>
-            <w:r>
-              <w:rPr>
-                <w:rFonts w:ascii="Courier New" w:hAnsi="Courier New" w:cs="Courier New"/>
-                <w:noProof/>
-                <w:sz w:val="18"/>
-                <w:szCs w:val="18"/>
-              </w:rPr>
-              <w:t xml:space="preserve">       "license": "https://openid.net/intellectual-property/licenses/fastfed/1.0/"</w:t>
+              <w:t>.com/fastfed/register",</w:t>
+            </w:r>
+          </w:p>
+          <w:p>
+            <w:pPr>
+              <w:rPr>
+                <w:rFonts w:ascii="Courier New" w:hAnsi="Courier New" w:cs="Courier New"/>
+                <w:noProof/>
+                <w:sz w:val="18"/>
+                <w:szCs w:val="18"/>
+              </w:rPr>
+            </w:pPr>
+          </w:p>
+          <w:p>
+            <w:pPr>
+              <w:rPr>
+                <w:rFonts w:ascii="Courier New" w:hAnsi="Courier New" w:cs="Courier New"/>
+                <w:noProof/>
+                <w:sz w:val="18"/>
+                <w:szCs w:val="18"/>
+              </w:rPr>
+            </w:pPr>
+            <w:r>
+              <w:rPr>
+                <w:rFonts w:ascii="Courier New" w:hAnsi="Courier New" w:cs="Courier New"/>
+                <w:noProof/>
+                <w:sz w:val="18"/>
+                <w:szCs w:val="18"/>
+              </w:rPr>
+              <w:t xml:space="preserve">     "urn:ietf:params:fastfed:1.0:provisioning:</w:t>
+            </w:r>
+            <w:r>
+              <w:rPr>
+                <w:rFonts w:ascii="Courier New" w:hAnsi="Courier New" w:cs="Courier New"/>
+                <w:noProof/>
+                <w:sz w:val="18"/>
+                <w:szCs w:val="18"/>
+              </w:rPr>
+              <w:t>saml:2.0:basic</w:t>
+            </w:r>
+            <w:r>
+              <w:rPr>
+                <w:rFonts w:ascii="Courier New" w:hAnsi="Courier New" w:cs="Courier New"/>
+                <w:noProof/>
+                <w:sz w:val="18"/>
+                <w:szCs w:val="18"/>
+              </w:rPr>
+              <w:t>": {</w:t>
+            </w:r>
+          </w:p>
+          <w:p>
+            <w:pPr>
+              <w:rPr>
+                <w:rFonts w:ascii="Courier New" w:hAnsi="Courier New" w:cs="Courier New"/>
+                <w:noProof/>
+                <w:sz w:val="18"/>
+                <w:szCs w:val="18"/>
+              </w:rPr>
+            </w:pPr>
+            <w:r>
+              <w:rPr>
+                <w:rFonts w:ascii="Courier New" w:hAnsi="Courier New" w:cs="Courier New"/>
+                <w:noProof/>
+                <w:sz w:val="18"/>
+                <w:szCs w:val="18"/>
+              </w:rPr>
+              <w:t xml:space="preserve">       "desired_attributes": {</w:t>
+            </w:r>
+          </w:p>
+          <w:p>
+            <w:pPr>
+              <w:rPr>
+                <w:rFonts w:ascii="Courier New" w:hAnsi="Courier New" w:cs="Courier New"/>
+                <w:noProof/>
+                <w:sz w:val="18"/>
+                <w:szCs w:val="18"/>
+              </w:rPr>
+            </w:pPr>
+            <w:r>
+              <w:rPr>
+                <w:rFonts w:ascii="Courier New" w:hAnsi="Courier New" w:cs="Courier New"/>
+                <w:noProof/>
+                <w:sz w:val="18"/>
+                <w:szCs w:val="18"/>
+              </w:rPr>
+              <w:t xml:space="preserve">         "urn:ietf:params:fastfed:1:0:schemas:scim:2.0": {</w:t>
+            </w:r>
+          </w:p>
+          <w:p>
+            <w:pPr>
+              <w:rPr>
+                <w:rFonts w:ascii="Courier New" w:hAnsi="Courier New" w:cs="Courier New"/>
+                <w:noProof/>
+                <w:sz w:val="18"/>
+                <w:szCs w:val="18"/>
+              </w:rPr>
+            </w:pPr>
+            <w:r>
+              <w:rPr>
+                <w:rFonts w:ascii="Courier New" w:hAnsi="Courier New" w:cs="Courier New"/>
+                <w:noProof/>
+                <w:sz w:val="18"/>
+                <w:szCs w:val="18"/>
+              </w:rPr>
+              <w:t xml:space="preserve">           "required_user_attributes": [</w:t>
+            </w:r>
+          </w:p>
+          <w:p>
+            <w:pPr>
+              <w:rPr>
+                <w:rFonts w:ascii="Courier New" w:hAnsi="Courier New" w:cs="Courier New"/>
+                <w:noProof/>
+                <w:sz w:val="18"/>
+                <w:szCs w:val="18"/>
+              </w:rPr>
+            </w:pPr>
+            <w:r>
+              <w:rPr>
+                <w:rFonts w:ascii="Courier New" w:hAnsi="Courier New" w:cs="Courier New"/>
+                <w:noProof/>
+                <w:sz w:val="18"/>
+                <w:szCs w:val="18"/>
+              </w:rPr>
+              <w:t xml:space="preserve">             "username"</w:t>
+            </w:r>
+          </w:p>
+          <w:p>
+            <w:pPr>
+              <w:rPr>
+                <w:rFonts w:ascii="Courier New" w:hAnsi="Courier New" w:cs="Courier New"/>
+                <w:noProof/>
+                <w:sz w:val="18"/>
+                <w:szCs w:val="18"/>
+              </w:rPr>
+            </w:pPr>
+            <w:r>
+              <w:rPr>
+                <w:rFonts w:ascii="Courier New" w:hAnsi="Courier New" w:cs="Courier New"/>
+                <w:noProof/>
+                <w:sz w:val="18"/>
+                <w:szCs w:val="18"/>
+              </w:rPr>
+              <w:t xml:space="preserve">           ],</w:t>
+            </w:r>
+          </w:p>
+          <w:p>
+            <w:pPr>
+              <w:rPr>
+                <w:rFonts w:ascii="Courier New" w:hAnsi="Courier New" w:cs="Courier New"/>
+                <w:noProof/>
+                <w:sz w:val="18"/>
+                <w:szCs w:val="18"/>
+              </w:rPr>
+            </w:pPr>
+            <w:r>
+              <w:rPr>
+                <w:rFonts w:ascii="Courier New" w:hAnsi="Courier New" w:cs="Courier New"/>
+                <w:noProof/>
+                <w:sz w:val="18"/>
+                <w:szCs w:val="18"/>
+              </w:rPr>
+              <w:t xml:space="preserve">           "optional_user_attributes": [</w:t>
+            </w:r>
+          </w:p>
+          <w:p>
+            <w:pPr>
+              <w:rPr>
+                <w:rFonts w:ascii="Courier New" w:hAnsi="Courier New" w:cs="Courier New"/>
+                <w:noProof/>
+                <w:sz w:val="18"/>
+                <w:szCs w:val="18"/>
+              </w:rPr>
+            </w:pPr>
+            <w:r>
+              <w:rPr>
+                <w:rFonts w:ascii="Courier New" w:hAnsi="Courier New" w:cs="Courier New"/>
+                <w:noProof/>
+                <w:sz w:val="18"/>
+                <w:szCs w:val="18"/>
+              </w:rPr>
+              <w:t xml:space="preserve">             "displayName",</w:t>
+            </w:r>
+          </w:p>
+          <w:p>
+            <w:pPr>
+              <w:rPr>
+                <w:rFonts w:ascii="Courier New" w:hAnsi="Courier New" w:cs="Courier New"/>
+                <w:noProof/>
+                <w:sz w:val="18"/>
+                <w:szCs w:val="18"/>
+              </w:rPr>
+            </w:pPr>
+            <w:r>
+              <w:rPr>
+                <w:rFonts w:ascii="Courier New" w:hAnsi="Courier New" w:cs="Courier New"/>
+                <w:noProof/>
+                <w:sz w:val="18"/>
+                <w:szCs w:val="18"/>
+              </w:rPr>
+              <w:t xml:space="preserve">             "emails[primary eq true].value"</w:t>
+            </w:r>
+          </w:p>
+          <w:p>
+            <w:pPr>
+              <w:rPr>
+                <w:rFonts w:ascii="Courier New" w:hAnsi="Courier New" w:cs="Courier New"/>
+                <w:noProof/>
+                <w:sz w:val="18"/>
+                <w:szCs w:val="18"/>
+              </w:rPr>
+            </w:pPr>
+            <w:r>
+              <w:rPr>
+                <w:rFonts w:ascii="Courier New" w:hAnsi="Courier New" w:cs="Courier New"/>
+                <w:noProof/>
+                <w:sz w:val="18"/>
+                <w:szCs w:val="18"/>
+              </w:rPr>
+              <w:t xml:space="preserve">           ]</w:t>
+            </w:r>
+          </w:p>
+          <w:p>
+            <w:pPr>
+              <w:rPr>
+                <w:rFonts w:ascii="Courier New" w:hAnsi="Courier New" w:cs="Courier New"/>
+                <w:noProof/>
+                <w:sz w:val="18"/>
+                <w:szCs w:val="18"/>
+              </w:rPr>
+            </w:pPr>
+            <w:r>
+              <w:rPr>
+                <w:rFonts w:ascii="Courier New" w:hAnsi="Courier New" w:cs="Courier New"/>
+                <w:noProof/>
+                <w:sz w:val="18"/>
+                <w:szCs w:val="18"/>
+              </w:rPr>
+              <w:t xml:space="preserve">         }</w:t>
+            </w:r>
+          </w:p>
+          <w:p>
+            <w:pPr>
+              <w:rPr>
+                <w:rFonts w:ascii="Courier New" w:hAnsi="Courier New" w:cs="Courier New"/>
+                <w:noProof/>
+                <w:sz w:val="18"/>
+                <w:szCs w:val="18"/>
+              </w:rPr>
+            </w:pPr>
+            <w:r>
+              <w:rPr>
+                <w:rFonts w:ascii="Courier New" w:hAnsi="Courier New" w:cs="Courier New"/>
+                <w:noProof/>
+                <w:sz w:val="18"/>
+                <w:szCs w:val="18"/>
+              </w:rPr>
+              <w:t xml:space="preserve">      }</w:t>
+            </w:r>
+          </w:p>
+          <w:p>
+            <w:pPr>
+              <w:rPr>
+                <w:rFonts w:ascii="Courier New" w:hAnsi="Courier New" w:cs="Courier New"/>
+                <w:noProof/>
+                <w:sz w:val="18"/>
+                <w:szCs w:val="18"/>
+              </w:rPr>
+            </w:pPr>
+            <w:r>
+              <w:rPr>
+                <w:rFonts w:ascii="Courier New" w:hAnsi="Courier New" w:cs="Courier New"/>
+                <w:noProof/>
+                <w:sz w:val="18"/>
+                <w:szCs w:val="18"/>
+              </w:rPr>
+              <w:t xml:space="preserve">     },</w:t>
+            </w:r>
+          </w:p>
+          <w:p>
+            <w:pPr>
+              <w:rPr>
+                <w:rFonts w:ascii="Courier New" w:hAnsi="Courier New" w:cs="Courier New"/>
+                <w:noProof/>
+                <w:sz w:val="18"/>
+                <w:szCs w:val="18"/>
+              </w:rPr>
+            </w:pPr>
+          </w:p>
+          <w:p>
+            <w:pPr>
+              <w:rPr>
+                <w:rFonts w:ascii="Courier New" w:hAnsi="Courier New" w:cs="Courier New"/>
+                <w:noProof/>
+                <w:sz w:val="18"/>
+                <w:szCs w:val="18"/>
+              </w:rPr>
+            </w:pPr>
+            <w:r>
+              <w:rPr>
+                <w:rFonts w:ascii="Courier New" w:hAnsi="Courier New" w:cs="Courier New"/>
+                <w:noProof/>
+                <w:sz w:val="18"/>
+                <w:szCs w:val="18"/>
+              </w:rPr>
+              <w:t xml:space="preserve">     "urn:ietf:params:fastfed:1.0:provisioning:</w:t>
+            </w:r>
+            <w:r>
+              <w:rPr>
+                <w:rFonts w:ascii="Courier New" w:hAnsi="Courier New" w:cs="Courier New"/>
+                <w:noProof/>
+                <w:sz w:val="18"/>
+                <w:szCs w:val="18"/>
+              </w:rPr>
+              <w:t>scim:2.0:basic</w:t>
+            </w:r>
+            <w:r>
+              <w:rPr>
+                <w:rFonts w:ascii="Courier New" w:hAnsi="Courier New" w:cs="Courier New"/>
+                <w:noProof/>
+                <w:sz w:val="18"/>
+                <w:szCs w:val="18"/>
+              </w:rPr>
+              <w:t>": {</w:t>
+            </w:r>
+          </w:p>
+          <w:p>
+            <w:pPr>
+              <w:rPr>
+                <w:rFonts w:ascii="Courier New" w:hAnsi="Courier New" w:cs="Courier New"/>
+                <w:noProof/>
+                <w:sz w:val="18"/>
+                <w:szCs w:val="18"/>
+              </w:rPr>
+            </w:pPr>
+            <w:r>
+              <w:rPr>
+                <w:rFonts w:ascii="Courier New" w:hAnsi="Courier New" w:cs="Courier New"/>
+                <w:noProof/>
+                <w:sz w:val="18"/>
+                <w:szCs w:val="18"/>
+              </w:rPr>
+              <w:t xml:space="preserve">       "can_support_nested_groups": true,</w:t>
+            </w:r>
+          </w:p>
+          <w:p>
+            <w:pPr>
+              <w:rPr>
+                <w:rFonts w:ascii="Courier New" w:hAnsi="Courier New" w:cs="Courier New"/>
+                <w:noProof/>
+                <w:sz w:val="18"/>
+                <w:szCs w:val="18"/>
+              </w:rPr>
+            </w:pPr>
+            <w:r>
+              <w:rPr>
+                <w:rFonts w:ascii="Courier New" w:hAnsi="Courier New" w:cs="Courier New"/>
+                <w:noProof/>
+                <w:sz w:val="18"/>
+                <w:szCs w:val="18"/>
+              </w:rPr>
+              <w:t xml:space="preserve">       "max_group_membership_changes": 1000,</w:t>
+            </w:r>
+          </w:p>
+          <w:p>
+            <w:pPr>
+              <w:rPr>
+                <w:rFonts w:ascii="Courier New" w:hAnsi="Courier New" w:cs="Courier New"/>
+                <w:noProof/>
+                <w:sz w:val="18"/>
+                <w:szCs w:val="18"/>
+              </w:rPr>
+            </w:pPr>
+            <w:r>
+              <w:rPr>
+                <w:rFonts w:ascii="Courier New" w:hAnsi="Courier New" w:cs="Courier New"/>
+                <w:noProof/>
+                <w:sz w:val="18"/>
+                <w:szCs w:val="18"/>
+              </w:rPr>
+              <w:t xml:space="preserve">       "desired_attributes": {</w:t>
+            </w:r>
+          </w:p>
+          <w:p>
+            <w:pPr>
+              <w:rPr>
+                <w:rFonts w:ascii="Courier New" w:hAnsi="Courier New" w:cs="Courier New"/>
+                <w:noProof/>
+                <w:sz w:val="18"/>
+                <w:szCs w:val="18"/>
+              </w:rPr>
+            </w:pPr>
+            <w:r>
+              <w:rPr>
+                <w:rFonts w:ascii="Courier New" w:hAnsi="Courier New" w:cs="Courier New"/>
+                <w:noProof/>
+                <w:sz w:val="18"/>
+                <w:szCs w:val="18"/>
+              </w:rPr>
+              <w:t xml:space="preserve">         "urn:ietf:params:fastfed:1:0:schemas:scim:2.0": {</w:t>
+            </w:r>
+          </w:p>
+          <w:p>
+            <w:pPr>
+              <w:rPr>
+                <w:rFonts w:ascii="Courier New" w:hAnsi="Courier New" w:cs="Courier New"/>
+                <w:noProof/>
+                <w:sz w:val="18"/>
+                <w:szCs w:val="18"/>
+              </w:rPr>
+            </w:pPr>
+            <w:r>
+              <w:rPr>
+                <w:rFonts w:ascii="Courier New" w:hAnsi="Courier New" w:cs="Courier New"/>
+                <w:noProof/>
+                <w:sz w:val="18"/>
+                <w:szCs w:val="18"/>
+              </w:rPr>
+              <w:t xml:space="preserve">           "required_user_attributes": [</w:t>
+            </w:r>
+          </w:p>
+          <w:p>
+            <w:pPr>
+              <w:rPr>
+                <w:rFonts w:ascii="Courier New" w:hAnsi="Courier New" w:cs="Courier New"/>
+                <w:noProof/>
+                <w:sz w:val="18"/>
+                <w:szCs w:val="18"/>
+              </w:rPr>
+            </w:pPr>
+            <w:r>
+              <w:rPr>
+                <w:rFonts w:ascii="Courier New" w:hAnsi="Courier New" w:cs="Courier New"/>
+                <w:noProof/>
+                <w:sz w:val="18"/>
+                <w:szCs w:val="18"/>
+              </w:rPr>
+              <w:t xml:space="preserve">             "externalId",</w:t>
+            </w:r>
+          </w:p>
+          <w:p>
+            <w:pPr>
+              <w:rPr>
+                <w:rFonts w:ascii="Courier New" w:hAnsi="Courier New" w:cs="Courier New"/>
+                <w:noProof/>
+                <w:sz w:val="18"/>
+                <w:szCs w:val="18"/>
+              </w:rPr>
+            </w:pPr>
+            <w:r>
+              <w:rPr>
+                <w:rFonts w:ascii="Courier New" w:hAnsi="Courier New" w:cs="Courier New"/>
+                <w:noProof/>
+                <w:sz w:val="18"/>
+                <w:szCs w:val="18"/>
+              </w:rPr>
+              <w:t xml:space="preserve">             "username",</w:t>
+            </w:r>
+          </w:p>
+          <w:p>
+            <w:pPr>
+              <w:rPr>
+                <w:rFonts w:ascii="Courier New" w:hAnsi="Courier New" w:cs="Courier New"/>
+                <w:noProof/>
+                <w:sz w:val="18"/>
+                <w:szCs w:val="18"/>
+              </w:rPr>
+            </w:pPr>
+            <w:r>
+              <w:rPr>
+                <w:rFonts w:ascii="Courier New" w:hAnsi="Courier New" w:cs="Courier New"/>
+                <w:noProof/>
+                <w:sz w:val="18"/>
+                <w:szCs w:val="18"/>
+              </w:rPr>
+              <w:t xml:space="preserve">             "active"</w:t>
+            </w:r>
+          </w:p>
+          <w:p>
+            <w:pPr>
+              <w:rPr>
+                <w:rFonts w:ascii="Courier New" w:hAnsi="Courier New" w:cs="Courier New"/>
+                <w:noProof/>
+                <w:sz w:val="18"/>
+                <w:szCs w:val="18"/>
+              </w:rPr>
+            </w:pPr>
+            <w:r>
+              <w:rPr>
+                <w:rFonts w:ascii="Courier New" w:hAnsi="Courier New" w:cs="Courier New"/>
+                <w:noProof/>
+                <w:sz w:val="18"/>
+                <w:szCs w:val="18"/>
+              </w:rPr>
+              <w:t xml:space="preserve">           ],</w:t>
+            </w:r>
+          </w:p>
+          <w:p>
+            <w:pPr>
+              <w:rPr>
+                <w:rFonts w:ascii="Courier New" w:hAnsi="Courier New" w:cs="Courier New"/>
+                <w:noProof/>
+                <w:sz w:val="18"/>
+                <w:szCs w:val="18"/>
+              </w:rPr>
+            </w:pPr>
+            <w:r>
+              <w:rPr>
+                <w:rFonts w:ascii="Courier New" w:hAnsi="Courier New" w:cs="Courier New"/>
+                <w:noProof/>
+                <w:sz w:val="18"/>
+                <w:szCs w:val="18"/>
+              </w:rPr>
+              <w:t xml:space="preserve">           "optional_user_attributes": [</w:t>
+            </w:r>
+          </w:p>
+          <w:p>
+            <w:pPr>
+              <w:rPr>
+                <w:rFonts w:ascii="Courier New" w:hAnsi="Courier New" w:cs="Courier New"/>
+                <w:noProof/>
+                <w:sz w:val="18"/>
+                <w:szCs w:val="18"/>
+              </w:rPr>
+            </w:pPr>
+            <w:r>
+              <w:rPr>
+                <w:rFonts w:ascii="Courier New" w:hAnsi="Courier New" w:cs="Courier New"/>
+                <w:noProof/>
+                <w:sz w:val="18"/>
+                <w:szCs w:val="18"/>
+              </w:rPr>
+              <w:t xml:space="preserve">             "displayName",</w:t>
+            </w:r>
+          </w:p>
+          <w:p>
+            <w:pPr>
+              <w:rPr>
+                <w:rFonts w:ascii="Courier New" w:hAnsi="Courier New" w:cs="Courier New"/>
+                <w:noProof/>
+                <w:sz w:val="18"/>
+                <w:szCs w:val="18"/>
+              </w:rPr>
+            </w:pPr>
+            <w:r>
+              <w:rPr>
+                <w:rFonts w:ascii="Courier New" w:hAnsi="Courier New" w:cs="Courier New"/>
+                <w:noProof/>
+                <w:sz w:val="18"/>
+                <w:szCs w:val="18"/>
+              </w:rPr>
+              <w:t xml:space="preserve">             "emails[primary eq true]"</w:t>
+            </w:r>
+          </w:p>
+          <w:p>
+            <w:pPr>
+              <w:rPr>
+                <w:rFonts w:ascii="Courier New" w:hAnsi="Courier New" w:cs="Courier New"/>
+                <w:noProof/>
+                <w:sz w:val="18"/>
+                <w:szCs w:val="18"/>
+              </w:rPr>
+            </w:pPr>
+            <w:r>
+              <w:rPr>
+                <w:rFonts w:ascii="Courier New" w:hAnsi="Courier New" w:cs="Courier New"/>
+                <w:noProof/>
+                <w:sz w:val="18"/>
+                <w:szCs w:val="18"/>
+              </w:rPr>
+              <w:t xml:space="preserve">           ]</w:t>
+            </w:r>
+          </w:p>
+          <w:p>
+            <w:pPr>
+              <w:rPr>
+                <w:rFonts w:ascii="Courier New" w:hAnsi="Courier New" w:cs="Courier New"/>
+                <w:noProof/>
+                <w:sz w:val="18"/>
+                <w:szCs w:val="18"/>
+              </w:rPr>
+            </w:pPr>
+            <w:r>
+              <w:rPr>
+                <w:rFonts w:ascii="Courier New" w:hAnsi="Courier New" w:cs="Courier New"/>
+                <w:noProof/>
+                <w:sz w:val="18"/>
+                <w:szCs w:val="18"/>
+              </w:rPr>
+              <w:t xml:space="preserve">           "required_group_attributes": [</w:t>
+            </w:r>
+          </w:p>
+          <w:p>
+            <w:pPr>
+              <w:rPr>
+                <w:rFonts w:ascii="Courier New" w:hAnsi="Courier New" w:cs="Courier New"/>
+                <w:noProof/>
+                <w:sz w:val="18"/>
+                <w:szCs w:val="18"/>
+              </w:rPr>
+            </w:pPr>
+            <w:r>
+              <w:rPr>
+                <w:rFonts w:ascii="Courier New" w:hAnsi="Courier New" w:cs="Courier New"/>
+                <w:noProof/>
+                <w:sz w:val="18"/>
+                <w:szCs w:val="18"/>
+              </w:rPr>
+              <w:t xml:space="preserve">             "displayName",</w:t>
+            </w:r>
+          </w:p>
+          <w:p>
+            <w:pPr>
+              <w:rPr>
+                <w:rFonts w:ascii="Courier New" w:hAnsi="Courier New" w:cs="Courier New"/>
+                <w:noProof/>
+                <w:sz w:val="18"/>
+                <w:szCs w:val="18"/>
+              </w:rPr>
+            </w:pPr>
+            <w:r>
+              <w:rPr>
+                <w:rFonts w:ascii="Courier New" w:hAnsi="Courier New" w:cs="Courier New"/>
+                <w:noProof/>
+                <w:sz w:val="18"/>
+                <w:szCs w:val="18"/>
+              </w:rPr>
+              <w:t xml:space="preserve">             "externalId"</w:t>
+            </w:r>
+          </w:p>
+          <w:p>
+            <w:pPr>
+              <w:rPr>
+                <w:rFonts w:ascii="Courier New" w:hAnsi="Courier New" w:cs="Courier New"/>
+                <w:noProof/>
+                <w:sz w:val="18"/>
+                <w:szCs w:val="18"/>
+              </w:rPr>
+            </w:pPr>
+            <w:r>
+              <w:rPr>
+                <w:rFonts w:ascii="Courier New" w:hAnsi="Courier New" w:cs="Courier New"/>
+                <w:noProof/>
+                <w:sz w:val="18"/>
+                <w:szCs w:val="18"/>
+              </w:rPr>
+              <w:t xml:space="preserve">           ],</w:t>
+            </w:r>
+          </w:p>
+          <w:p>
+            <w:pPr>
+              <w:rPr>
+                <w:rFonts w:ascii="Courier New" w:hAnsi="Courier New" w:cs="Courier New"/>
+                <w:noProof/>
+                <w:sz w:val="18"/>
+                <w:szCs w:val="18"/>
+              </w:rPr>
+            </w:pPr>
+            <w:r>
+              <w:rPr>
+                <w:rFonts w:ascii="Courier New" w:hAnsi="Courier New" w:cs="Courier New"/>
+                <w:noProof/>
+                <w:sz w:val="18"/>
+                <w:szCs w:val="18"/>
+              </w:rPr>
+              <w:t xml:space="preserve">           "optional_group_attributes": [</w:t>
+            </w:r>
+          </w:p>
+          <w:p>
+            <w:pPr>
+              <w:rPr>
+                <w:rFonts w:ascii="Courier New" w:hAnsi="Courier New" w:cs="Courier New"/>
+                <w:noProof/>
+                <w:sz w:val="18"/>
+                <w:szCs w:val="18"/>
+              </w:rPr>
+            </w:pPr>
+            <w:r>
+              <w:rPr>
+                <w:rFonts w:ascii="Courier New" w:hAnsi="Courier New" w:cs="Courier New"/>
+                <w:noProof/>
+                <w:sz w:val="18"/>
+                <w:szCs w:val="18"/>
+              </w:rPr>
+              <w:t xml:space="preserve">             "members"</w:t>
+            </w:r>
+          </w:p>
+          <w:p>
+            <w:pPr>
+              <w:rPr>
+                <w:rFonts w:ascii="Courier New" w:hAnsi="Courier New" w:cs="Courier New"/>
+                <w:noProof/>
+                <w:sz w:val="18"/>
+                <w:szCs w:val="18"/>
+              </w:rPr>
+            </w:pPr>
+            <w:r>
+              <w:rPr>
+                <w:rFonts w:ascii="Courier New" w:hAnsi="Courier New" w:cs="Courier New"/>
+                <w:noProof/>
+                <w:sz w:val="18"/>
+                <w:szCs w:val="18"/>
+              </w:rPr>
+              <w:t xml:space="preserve">           ]</w:t>
+            </w:r>
+          </w:p>
+          <w:p>
+            <w:pPr>
+              <w:rPr>
+                <w:rFonts w:ascii="Courier New" w:hAnsi="Courier New" w:cs="Courier New"/>
+                <w:noProof/>
+                <w:sz w:val="18"/>
+                <w:szCs w:val="18"/>
+              </w:rPr>
+            </w:pPr>
+            <w:r>
+              <w:rPr>
+                <w:rFonts w:ascii="Courier New" w:hAnsi="Courier New" w:cs="Courier New"/>
+                <w:noProof/>
+                <w:sz w:val="18"/>
+                <w:szCs w:val="18"/>
+              </w:rPr>
+              <w:t xml:space="preserve">         }</w:t>
+            </w:r>
+          </w:p>
+          <w:p>
+            <w:pPr>
+              <w:rPr>
+                <w:rFonts w:ascii="Courier New" w:hAnsi="Courier New" w:cs="Courier New"/>
+                <w:noProof/>
+                <w:sz w:val="18"/>
+                <w:szCs w:val="18"/>
+              </w:rPr>
+            </w:pPr>
+            <w:r>
+              <w:rPr>
+                <w:rFonts w:ascii="Courier New" w:hAnsi="Courier New" w:cs="Courier New"/>
+                <w:noProof/>
+                <w:sz w:val="18"/>
+                <w:szCs w:val="18"/>
+              </w:rPr>
+              <w:t xml:space="preserve">      </w:t>
+            </w:r>
+            <w:r>
+              <w:rPr>
+                <w:rFonts w:ascii="Courier New" w:hAnsi="Courier New" w:cs="Courier New"/>
+                <w:noProof/>
+                <w:sz w:val="18"/>
+                <w:szCs w:val="18"/>
+              </w:rPr>
+              <w:t xml:space="preserve"> </w:t>
+            </w:r>
+            <w:r>
+              <w:rPr>
+                <w:rFonts w:ascii="Courier New" w:hAnsi="Courier New" w:cs="Courier New"/>
+                <w:noProof/>
+                <w:sz w:val="18"/>
+                <w:szCs w:val="18"/>
+              </w:rPr>
+              <w:t>}</w:t>
             </w:r>
           </w:p>
           <w:p>
@@ -3917,679 +5139,7 @@
                 <w:sz w:val="18"/>
                 <w:szCs w:val="18"/>
               </w:rPr>
-              <w:t xml:space="preserve">     "capabilities": {</w:t>
-            </w:r>
-          </w:p>
-          <w:p>
-            <w:pPr>
-              <w:rPr>
-                <w:rFonts w:ascii="Courier New" w:hAnsi="Courier New" w:cs="Courier New"/>
-                <w:noProof/>
-                <w:sz w:val="18"/>
-                <w:szCs w:val="18"/>
-              </w:rPr>
-            </w:pPr>
-            <w:r>
-              <w:rPr>
-                <w:rFonts w:ascii="Courier New" w:hAnsi="Courier New" w:cs="Courier New"/>
-                <w:noProof/>
-                <w:sz w:val="18"/>
-                <w:szCs w:val="18"/>
-              </w:rPr>
-              <w:t xml:space="preserve">       "authentication_profiles": [</w:t>
-            </w:r>
-          </w:p>
-          <w:p>
-            <w:pPr>
-              <w:rPr>
-                <w:rFonts w:ascii="Courier New" w:hAnsi="Courier New" w:cs="Courier New"/>
-                <w:noProof/>
-                <w:sz w:val="18"/>
-                <w:szCs w:val="18"/>
-              </w:rPr>
-            </w:pPr>
-            <w:r>
-              <w:rPr>
-                <w:rFonts w:ascii="Courier New" w:hAnsi="Courier New" w:cs="Courier New"/>
-                <w:noProof/>
-                <w:sz w:val="18"/>
-                <w:szCs w:val="18"/>
-              </w:rPr>
-              <w:t xml:space="preserve">         "urn:ietf:params:fastfed:1.0:authentication:SAML:Basic"</w:t>
-            </w:r>
-          </w:p>
-          <w:p>
-            <w:pPr>
-              <w:rPr>
-                <w:rFonts w:ascii="Courier New" w:hAnsi="Courier New" w:cs="Courier New"/>
-                <w:noProof/>
-                <w:sz w:val="18"/>
-                <w:szCs w:val="18"/>
-              </w:rPr>
-            </w:pPr>
-            <w:r>
-              <w:rPr>
-                <w:rFonts w:ascii="Courier New" w:hAnsi="Courier New" w:cs="Courier New"/>
-                <w:noProof/>
-                <w:sz w:val="18"/>
-                <w:szCs w:val="18"/>
-              </w:rPr>
-              <w:t xml:space="preserve">       ],</w:t>
-            </w:r>
-          </w:p>
-          <w:p>
-            <w:pPr>
-              <w:rPr>
-                <w:rFonts w:ascii="Courier New" w:hAnsi="Courier New" w:cs="Courier New"/>
-                <w:noProof/>
-                <w:sz w:val="18"/>
-                <w:szCs w:val="18"/>
-              </w:rPr>
-            </w:pPr>
-            <w:r>
-              <w:rPr>
-                <w:rFonts w:ascii="Courier New" w:hAnsi="Courier New" w:cs="Courier New"/>
-                <w:noProof/>
-                <w:sz w:val="18"/>
-                <w:szCs w:val="18"/>
-              </w:rPr>
-              <w:t xml:space="preserve">       "provisioning_profiles": [</w:t>
-            </w:r>
-          </w:p>
-          <w:p>
-            <w:pPr>
-              <w:rPr>
-                <w:rFonts w:ascii="Courier New" w:hAnsi="Courier New" w:cs="Courier New"/>
-                <w:noProof/>
-                <w:sz w:val="18"/>
-                <w:szCs w:val="18"/>
-              </w:rPr>
-            </w:pPr>
-            <w:r>
-              <w:rPr>
-                <w:rFonts w:ascii="Courier New" w:hAnsi="Courier New" w:cs="Courier New"/>
-                <w:noProof/>
-                <w:sz w:val="18"/>
-                <w:szCs w:val="18"/>
-              </w:rPr>
-              <w:t xml:space="preserve">         "urn:ietf:params:fastfed:1.0:provisioning:SCIM:FullLifeCycle"</w:t>
-            </w:r>
-          </w:p>
-          <w:p>
-            <w:pPr>
-              <w:rPr>
-                <w:rFonts w:ascii="Courier New" w:hAnsi="Courier New" w:cs="Courier New"/>
-                <w:noProof/>
-                <w:sz w:val="18"/>
-                <w:szCs w:val="18"/>
-              </w:rPr>
-            </w:pPr>
-            <w:r>
-              <w:rPr>
-                <w:rFonts w:ascii="Courier New" w:hAnsi="Courier New" w:cs="Courier New"/>
-                <w:noProof/>
-                <w:sz w:val="18"/>
-                <w:szCs w:val="18"/>
-              </w:rPr>
-              <w:t xml:space="preserve">       ],</w:t>
-            </w:r>
-          </w:p>
-          <w:p>
-            <w:pPr>
-              <w:rPr>
-                <w:rFonts w:ascii="Courier New" w:hAnsi="Courier New" w:cs="Courier New"/>
-                <w:noProof/>
-                <w:sz w:val="18"/>
-                <w:szCs w:val="18"/>
-              </w:rPr>
-            </w:pPr>
-            <w:r>
-              <w:rPr>
-                <w:rFonts w:ascii="Courier New" w:hAnsi="Courier New" w:cs="Courier New"/>
-                <w:noProof/>
-                <w:sz w:val="18"/>
-                <w:szCs w:val="18"/>
-              </w:rPr>
-              <w:t xml:space="preserve">       "schema_grammars": [</w:t>
-            </w:r>
-          </w:p>
-          <w:p>
-            <w:pPr>
-              <w:rPr>
-                <w:rFonts w:ascii="Courier New" w:hAnsi="Courier New" w:cs="Courier New"/>
-                <w:noProof/>
-                <w:sz w:val="18"/>
-                <w:szCs w:val="18"/>
-              </w:rPr>
-            </w:pPr>
-            <w:r>
-              <w:rPr>
-                <w:rFonts w:ascii="Courier New" w:hAnsi="Courier New" w:cs="Courier New"/>
-                <w:noProof/>
-                <w:sz w:val="18"/>
-                <w:szCs w:val="18"/>
-              </w:rPr>
-              <w:t xml:space="preserve">         "urn:ietf:params:fastfed:1:0:schemas:scim:2.0"</w:t>
-            </w:r>
-          </w:p>
-          <w:p>
-            <w:pPr>
-              <w:rPr>
-                <w:rFonts w:ascii="Courier New" w:hAnsi="Courier New" w:cs="Courier New"/>
-                <w:noProof/>
-                <w:sz w:val="18"/>
-                <w:szCs w:val="18"/>
-              </w:rPr>
-            </w:pPr>
-            <w:r>
-              <w:rPr>
-                <w:rFonts w:ascii="Courier New" w:hAnsi="Courier New" w:cs="Courier New"/>
-                <w:noProof/>
-                <w:sz w:val="18"/>
-                <w:szCs w:val="18"/>
-              </w:rPr>
-              <w:t xml:space="preserve">       ],</w:t>
-            </w:r>
-          </w:p>
-          <w:p>
-            <w:pPr>
-              <w:rPr>
-                <w:rFonts w:ascii="Courier New" w:hAnsi="Courier New" w:cs="Courier New"/>
-                <w:noProof/>
-                <w:sz w:val="18"/>
-                <w:szCs w:val="18"/>
-              </w:rPr>
-            </w:pPr>
-            <w:r>
-              <w:rPr>
-                <w:rFonts w:ascii="Courier New" w:hAnsi="Courier New" w:cs="Courier New"/>
-                <w:noProof/>
-                <w:sz w:val="18"/>
-                <w:szCs w:val="18"/>
-              </w:rPr>
-              <w:t xml:space="preserve">       "signing_alg_values_supported": [</w:t>
-            </w:r>
-          </w:p>
-          <w:p>
-            <w:pPr>
-              <w:rPr>
-                <w:rFonts w:ascii="Courier New" w:hAnsi="Courier New" w:cs="Courier New"/>
-                <w:noProof/>
-                <w:sz w:val="18"/>
-                <w:szCs w:val="18"/>
-              </w:rPr>
-            </w:pPr>
-            <w:r>
-              <w:rPr>
-                <w:rFonts w:ascii="Courier New" w:hAnsi="Courier New" w:cs="Courier New"/>
-                <w:noProof/>
-                <w:sz w:val="18"/>
-                <w:szCs w:val="18"/>
-              </w:rPr>
-              <w:t xml:space="preserve">         "ES512",</w:t>
-            </w:r>
-          </w:p>
-          <w:p>
-            <w:pPr>
-              <w:rPr>
-                <w:rFonts w:ascii="Courier New" w:hAnsi="Courier New" w:cs="Courier New"/>
-                <w:noProof/>
-                <w:sz w:val="18"/>
-                <w:szCs w:val="18"/>
-              </w:rPr>
-            </w:pPr>
-            <w:r>
-              <w:rPr>
-                <w:rFonts w:ascii="Courier New" w:hAnsi="Courier New" w:cs="Courier New"/>
-                <w:noProof/>
-                <w:sz w:val="18"/>
-                <w:szCs w:val="18"/>
-              </w:rPr>
-              <w:t xml:space="preserve">         "RS256"</w:t>
-            </w:r>
-          </w:p>
-          <w:p>
-            <w:pPr>
-              <w:rPr>
-                <w:rFonts w:ascii="Courier New" w:hAnsi="Courier New" w:cs="Courier New"/>
-                <w:noProof/>
-                <w:sz w:val="18"/>
-                <w:szCs w:val="18"/>
-              </w:rPr>
-            </w:pPr>
-            <w:r>
-              <w:rPr>
-                <w:rFonts w:ascii="Courier New" w:hAnsi="Courier New" w:cs="Courier New"/>
-                <w:noProof/>
-                <w:sz w:val="18"/>
-                <w:szCs w:val="18"/>
-              </w:rPr>
-              <w:t xml:space="preserve">       ]</w:t>
-            </w:r>
-          </w:p>
-          <w:p>
-            <w:pPr>
-              <w:rPr>
-                <w:rFonts w:ascii="Courier New" w:hAnsi="Courier New" w:cs="Courier New"/>
-                <w:noProof/>
-                <w:sz w:val="18"/>
-                <w:szCs w:val="18"/>
-              </w:rPr>
-            </w:pPr>
-            <w:r>
-              <w:rPr>
-                <w:rFonts w:ascii="Courier New" w:hAnsi="Courier New" w:cs="Courier New"/>
-                <w:noProof/>
-                <w:sz w:val="18"/>
-                <w:szCs w:val="18"/>
-              </w:rPr>
-              <w:t xml:space="preserve">     },</w:t>
-            </w:r>
-          </w:p>
-          <w:p>
-            <w:pPr>
-              <w:rPr>
-                <w:rFonts w:ascii="Courier New" w:hAnsi="Courier New" w:cs="Courier New"/>
-                <w:noProof/>
-                <w:sz w:val="18"/>
-                <w:szCs w:val="18"/>
-              </w:rPr>
-            </w:pPr>
-            <w:r>
-              <w:rPr>
-                <w:rFonts w:ascii="Courier New" w:hAnsi="Courier New" w:cs="Courier New"/>
-                <w:noProof/>
-                <w:sz w:val="18"/>
-                <w:szCs w:val="18"/>
-              </w:rPr>
-              <w:t xml:space="preserve">     "fastfed_handshake_register_uri": </w:t>
-            </w:r>
-          </w:p>
-          <w:p>
-            <w:pPr>
-              <w:rPr>
-                <w:rFonts w:ascii="Courier New" w:hAnsi="Courier New" w:cs="Courier New"/>
-                <w:noProof/>
-                <w:sz w:val="18"/>
-                <w:szCs w:val="18"/>
-              </w:rPr>
-            </w:pPr>
-            <w:r>
-              <w:rPr>
-                <w:rFonts w:ascii="Courier New" w:hAnsi="Courier New" w:cs="Courier New"/>
-                <w:noProof/>
-                <w:sz w:val="18"/>
-                <w:szCs w:val="18"/>
-              </w:rPr>
-              <w:t xml:space="preserve">       </w:t>
-            </w:r>
-            <w:r>
-              <w:rPr>
-                <w:rFonts w:ascii="Courier New" w:hAnsi="Courier New" w:cs="Courier New"/>
-                <w:noProof/>
-                <w:sz w:val="18"/>
-                <w:szCs w:val="18"/>
-              </w:rPr>
-              <w:t>"https://tenant-67890.</w:t>
-            </w:r>
-            <w:r>
-              <w:rPr>
-                <w:rFonts w:ascii="Courier New" w:hAnsi="Courier New" w:cs="Courier New"/>
-                <w:noProof/>
-                <w:sz w:val="18"/>
-                <w:szCs w:val="18"/>
-              </w:rPr>
-              <w:t>onlineservice</w:t>
-            </w:r>
-            <w:r>
-              <w:rPr>
-                <w:rFonts w:ascii="Courier New" w:hAnsi="Courier New" w:cs="Courier New"/>
-                <w:noProof/>
-                <w:sz w:val="18"/>
-                <w:szCs w:val="18"/>
-              </w:rPr>
-              <w:t>.com/fastfed/register",</w:t>
-            </w:r>
-          </w:p>
-          <w:p>
-            <w:pPr>
-              <w:rPr>
-                <w:rFonts w:ascii="Courier New" w:hAnsi="Courier New" w:cs="Courier New"/>
-                <w:noProof/>
-                <w:sz w:val="18"/>
-                <w:szCs w:val="18"/>
-              </w:rPr>
-            </w:pPr>
-            <w:r>
-              <w:rPr>
-                <w:rFonts w:ascii="Courier New" w:hAnsi="Courier New" w:cs="Courier New"/>
-                <w:noProof/>
-                <w:sz w:val="18"/>
-                <w:szCs w:val="18"/>
-              </w:rPr>
-              <w:t xml:space="preserve">     "desired_user_attributes": {</w:t>
-            </w:r>
-          </w:p>
-          <w:p>
-            <w:pPr>
-              <w:rPr>
-                <w:rFonts w:ascii="Courier New" w:hAnsi="Courier New" w:cs="Courier New"/>
-                <w:noProof/>
-                <w:sz w:val="18"/>
-                <w:szCs w:val="18"/>
-              </w:rPr>
-            </w:pPr>
-            <w:r>
-              <w:rPr>
-                <w:rFonts w:ascii="Courier New" w:hAnsi="Courier New" w:cs="Courier New"/>
-                <w:noProof/>
-                <w:sz w:val="18"/>
-                <w:szCs w:val="18"/>
-              </w:rPr>
-              <w:t xml:space="preserve">       "urn:ietf:params:fastfed:1:0:schemas:scim:2.0": {</w:t>
-            </w:r>
-          </w:p>
-          <w:p>
-            <w:pPr>
-              <w:rPr>
-                <w:rFonts w:ascii="Courier New" w:hAnsi="Courier New" w:cs="Courier New"/>
-                <w:noProof/>
-                <w:sz w:val="18"/>
-                <w:szCs w:val="18"/>
-              </w:rPr>
-            </w:pPr>
-            <w:r>
-              <w:rPr>
-                <w:rFonts w:ascii="Courier New" w:hAnsi="Courier New" w:cs="Courier New"/>
-                <w:noProof/>
-                <w:sz w:val="18"/>
-                <w:szCs w:val="18"/>
-              </w:rPr>
-              <w:t xml:space="preserve">         "required_attributes": [</w:t>
-            </w:r>
-          </w:p>
-          <w:p>
-            <w:pPr>
-              <w:rPr>
-                <w:rFonts w:ascii="Courier New" w:hAnsi="Courier New" w:cs="Courier New"/>
-                <w:noProof/>
-                <w:sz w:val="18"/>
-                <w:szCs w:val="18"/>
-              </w:rPr>
-            </w:pPr>
-            <w:r>
-              <w:rPr>
-                <w:rFonts w:ascii="Courier New" w:hAnsi="Courier New" w:cs="Courier New"/>
-                <w:noProof/>
-                <w:sz w:val="18"/>
-                <w:szCs w:val="18"/>
-              </w:rPr>
-              <w:t xml:space="preserve">           "externalId",</w:t>
-            </w:r>
-          </w:p>
-          <w:p>
-            <w:pPr>
-              <w:rPr>
-                <w:rFonts w:ascii="Courier New" w:hAnsi="Courier New" w:cs="Courier New"/>
-                <w:noProof/>
-                <w:sz w:val="18"/>
-                <w:szCs w:val="18"/>
-              </w:rPr>
-            </w:pPr>
-            <w:r>
-              <w:rPr>
-                <w:rFonts w:ascii="Courier New" w:hAnsi="Courier New" w:cs="Courier New"/>
-                <w:noProof/>
-                <w:sz w:val="18"/>
-                <w:szCs w:val="18"/>
-              </w:rPr>
-              <w:t xml:space="preserve">           "username",</w:t>
-            </w:r>
-          </w:p>
-          <w:p>
-            <w:pPr>
-              <w:rPr>
-                <w:rFonts w:ascii="Courier New" w:hAnsi="Courier New" w:cs="Courier New"/>
-                <w:noProof/>
-                <w:sz w:val="18"/>
-                <w:szCs w:val="18"/>
-              </w:rPr>
-            </w:pPr>
-            <w:r>
-              <w:rPr>
-                <w:rFonts w:ascii="Courier New" w:hAnsi="Courier New" w:cs="Courier New"/>
-                <w:noProof/>
-                <w:sz w:val="18"/>
-                <w:szCs w:val="18"/>
-              </w:rPr>
-              <w:t xml:space="preserve">           "active",</w:t>
-            </w:r>
-          </w:p>
-          <w:p>
-            <w:pPr>
-              <w:rPr>
-                <w:rFonts w:ascii="Courier New" w:hAnsi="Courier New" w:cs="Courier New"/>
-                <w:noProof/>
-                <w:sz w:val="18"/>
-                <w:szCs w:val="18"/>
-              </w:rPr>
-            </w:pPr>
-            <w:r>
-              <w:rPr>
-                <w:rFonts w:ascii="Courier New" w:hAnsi="Courier New" w:cs="Courier New"/>
-                <w:noProof/>
-                <w:sz w:val="18"/>
-                <w:szCs w:val="18"/>
-              </w:rPr>
-              <w:t xml:space="preserve">           "emails[primary eq true]"</w:t>
-            </w:r>
-          </w:p>
-          <w:p>
-            <w:pPr>
-              <w:rPr>
-                <w:rFonts w:ascii="Courier New" w:hAnsi="Courier New" w:cs="Courier New"/>
-                <w:noProof/>
-                <w:sz w:val="18"/>
-                <w:szCs w:val="18"/>
-              </w:rPr>
-            </w:pPr>
-            <w:r>
-              <w:rPr>
-                <w:rFonts w:ascii="Courier New" w:hAnsi="Courier New" w:cs="Courier New"/>
-                <w:noProof/>
-                <w:sz w:val="18"/>
-                <w:szCs w:val="18"/>
-              </w:rPr>
-              <w:t xml:space="preserve">         ],</w:t>
-            </w:r>
-          </w:p>
-          <w:p>
-            <w:pPr>
-              <w:rPr>
-                <w:rFonts w:ascii="Courier New" w:hAnsi="Courier New" w:cs="Courier New"/>
-                <w:noProof/>
-                <w:sz w:val="18"/>
-                <w:szCs w:val="18"/>
-              </w:rPr>
-            </w:pPr>
-            <w:r>
-              <w:rPr>
-                <w:rFonts w:ascii="Courier New" w:hAnsi="Courier New" w:cs="Courier New"/>
-                <w:noProof/>
-                <w:sz w:val="18"/>
-                <w:szCs w:val="18"/>
-              </w:rPr>
-              <w:t xml:space="preserve">         "optional_attributes": [</w:t>
-            </w:r>
-          </w:p>
-          <w:p>
-            <w:pPr>
-              <w:rPr>
-                <w:rFonts w:ascii="Courier New" w:hAnsi="Courier New" w:cs="Courier New"/>
-                <w:noProof/>
-                <w:sz w:val="18"/>
-                <w:szCs w:val="18"/>
-              </w:rPr>
-            </w:pPr>
-            <w:r>
-              <w:rPr>
-                <w:rFonts w:ascii="Courier New" w:hAnsi="Courier New" w:cs="Courier New"/>
-                <w:noProof/>
-                <w:sz w:val="18"/>
-                <w:szCs w:val="18"/>
-              </w:rPr>
-              <w:t xml:space="preserve">           "displayName",</w:t>
-            </w:r>
-          </w:p>
-          <w:p>
-            <w:pPr>
-              <w:rPr>
-                <w:rFonts w:ascii="Courier New" w:hAnsi="Courier New" w:cs="Courier New"/>
-                <w:noProof/>
-                <w:sz w:val="18"/>
-                <w:szCs w:val="18"/>
-              </w:rPr>
-            </w:pPr>
-            <w:r>
-              <w:rPr>
-                <w:rFonts w:ascii="Courier New" w:hAnsi="Courier New" w:cs="Courier New"/>
-                <w:noProof/>
-                <w:sz w:val="18"/>
-                <w:szCs w:val="18"/>
-              </w:rPr>
-              <w:t xml:space="preserve">           "name.givenName",</w:t>
-            </w:r>
-          </w:p>
-          <w:p>
-            <w:pPr>
-              <w:rPr>
-                <w:rFonts w:ascii="Courier New" w:hAnsi="Courier New" w:cs="Courier New"/>
-                <w:noProof/>
-                <w:sz w:val="18"/>
-                <w:szCs w:val="18"/>
-              </w:rPr>
-            </w:pPr>
-            <w:r>
-              <w:rPr>
-                <w:rFonts w:ascii="Courier New" w:hAnsi="Courier New" w:cs="Courier New"/>
-                <w:noProof/>
-                <w:sz w:val="18"/>
-                <w:szCs w:val="18"/>
-              </w:rPr>
-              <w:t xml:space="preserve">           "name.familyName",</w:t>
-            </w:r>
-          </w:p>
-          <w:p>
-            <w:pPr>
-              <w:rPr>
-                <w:rFonts w:ascii="Courier New" w:hAnsi="Courier New" w:cs="Courier New"/>
-                <w:noProof/>
-                <w:sz w:val="18"/>
-                <w:szCs w:val="18"/>
-              </w:rPr>
-            </w:pPr>
-            <w:r>
-              <w:rPr>
-                <w:rFonts w:ascii="Courier New" w:hAnsi="Courier New" w:cs="Courier New"/>
-                <w:noProof/>
-                <w:sz w:val="18"/>
-                <w:szCs w:val="18"/>
-              </w:rPr>
-              <w:t xml:space="preserve">           "urn:ietf:params:scim:schemas:extension:enterprise:2.0:User:</w:t>
-            </w:r>
-            <w:r>
-              <w:rPr>
-                <w:rFonts w:ascii="Courier New" w:hAnsi="Courier New" w:cs="Courier New"/>
-                <w:noProof/>
-                <w:sz w:val="18"/>
-                <w:szCs w:val="18"/>
-              </w:rPr>
-              <w:t>costCenter</w:t>
-            </w:r>
-            <w:r>
-              <w:rPr>
-                <w:rFonts w:ascii="Courier New" w:hAnsi="Courier New" w:cs="Courier New"/>
-                <w:noProof/>
-                <w:sz w:val="18"/>
-                <w:szCs w:val="18"/>
-              </w:rPr>
-              <w:t>",</w:t>
-            </w:r>
-          </w:p>
-          <w:p>
-            <w:pPr>
-              <w:rPr>
-                <w:rFonts w:ascii="Courier New" w:hAnsi="Courier New" w:cs="Courier New"/>
-                <w:noProof/>
-                <w:sz w:val="18"/>
-                <w:szCs w:val="18"/>
-              </w:rPr>
-            </w:pPr>
-            <w:r>
-              <w:rPr>
-                <w:rFonts w:ascii="Courier New" w:hAnsi="Courier New" w:cs="Courier New"/>
-                <w:noProof/>
-                <w:sz w:val="18"/>
-                <w:szCs w:val="18"/>
-              </w:rPr>
-              <w:t xml:space="preserve">           "urn:scim:my:custom:schema:customAttribute"</w:t>
-            </w:r>
-          </w:p>
-          <w:p>
-            <w:pPr>
-              <w:rPr>
-                <w:rFonts w:ascii="Courier New" w:hAnsi="Courier New" w:cs="Courier New"/>
-                <w:noProof/>
-                <w:sz w:val="18"/>
-                <w:szCs w:val="18"/>
-              </w:rPr>
-            </w:pPr>
-            <w:r>
-              <w:rPr>
-                <w:rFonts w:ascii="Courier New" w:hAnsi="Courier New" w:cs="Courier New"/>
-                <w:noProof/>
-                <w:sz w:val="18"/>
-                <w:szCs w:val="18"/>
-              </w:rPr>
-              <w:t xml:space="preserve">         ]</w:t>
-            </w:r>
-          </w:p>
-          <w:p>
-            <w:pPr>
-              <w:rPr>
-                <w:rFonts w:ascii="Courier New" w:hAnsi="Courier New" w:cs="Courier New"/>
-                <w:noProof/>
-                <w:sz w:val="18"/>
-                <w:szCs w:val="18"/>
-              </w:rPr>
-            </w:pPr>
-            <w:r>
-              <w:rPr>
-                <w:rFonts w:ascii="Courier New" w:hAnsi="Courier New" w:cs="Courier New"/>
-                <w:noProof/>
-                <w:sz w:val="18"/>
-                <w:szCs w:val="18"/>
-              </w:rPr>
-              <w:t xml:space="preserve">       }</w:t>
-            </w:r>
-          </w:p>
-          <w:p>
-            <w:pPr>
-              <w:rPr>
-                <w:rFonts w:ascii="Courier New" w:hAnsi="Courier New" w:cs="Courier New"/>
-                <w:noProof/>
-                <w:sz w:val="18"/>
-                <w:szCs w:val="18"/>
-              </w:rPr>
-            </w:pPr>
-            <w:r>
-              <w:rPr>
-                <w:rFonts w:ascii="Courier New" w:hAnsi="Courier New" w:cs="Courier New"/>
-                <w:noProof/>
-                <w:sz w:val="18"/>
-                <w:szCs w:val="18"/>
-              </w:rPr>
-              <w:t xml:space="preserve">    }</w:t>
+              <w:t xml:space="preserve">   }</w:t>
             </w:r>
           </w:p>
           <w:p>
@@ -4608,7 +5158,16 @@
                 <w:sz w:val="18"/>
                 <w:szCs w:val="18"/>
               </w:rPr>
-              <w:t xml:space="preserve"> }</w:t>
+              <w:t xml:space="preserve"> </w:t>
+            </w:r>
+            <w:r>
+              <w:rPr>
+                <w:rFonts w:ascii="Courier New" w:hAnsi="Courier New" w:cs="Courier New"/>
+                <w:noProof/>
+                <w:sz w:val="18"/>
+                <w:szCs w:val="18"/>
+              </w:rPr>
+              <w:t>}</w:t>
             </w:r>
             <w:r>
               <w:rPr>
@@ -4826,7 +5385,6 @@
           <w:sz w:val="28"/>
           <w:szCs w:val="28"/>
         </w:rPr>
-        <w:lastRenderedPageBreak/>
         <w:t xml:space="preserve">Step </w:t>
       </w:r>
       <w:r>
@@ -4887,8 +5445,6 @@
         </w:rPr>
         <w:t>See specification:</w:t>
       </w:r>
-      <w:bookmarkStart w:id="0" w:name="_GoBack"/>
-      <w:bookmarkEnd w:id="0"/>
     </w:p>
     <w:p>
       <w:pPr>
@@ -5113,7 +5669,25 @@
                 <w:sz w:val="18"/>
                 <w:szCs w:val="18"/>
               </w:rPr>
-              <w:t>["urn:ietf:params:fastfed:1.0:authentication:SAML:Basic"],</w:t>
+              <w:t>["urn:ietf:params:fastfed:1.0:authentication:</w:t>
+            </w:r>
+            <w:r>
+              <w:rPr>
+                <w:rFonts w:ascii="Courier New" w:hAnsi="Courier New" w:cs="Courier New"/>
+                <w:noProof/>
+                <w:sz w:val="18"/>
+                <w:szCs w:val="18"/>
+              </w:rPr>
+              <w:t>saml:2.0:basic</w:t>
+            </w:r>
+            <w:r>
+              <w:rPr>
+                <w:rFonts w:ascii="Courier New" w:hAnsi="Courier New" w:cs="Courier New"/>
+                <w:noProof/>
+                <w:sz w:val="18"/>
+                <w:szCs w:val="18"/>
+              </w:rPr>
+              <w:t>"],</w:t>
             </w:r>
           </w:p>
           <w:p>
@@ -5169,7 +5743,25 @@
                 <w:sz w:val="18"/>
                 <w:szCs w:val="18"/>
               </w:rPr>
-              <w:t>["urn:ietf:params:fastfed:1.0:provisioning:SCIM:FullLifeCycle"],</w:t>
+              <w:t>["urn:ietf:params:fastfed:1.0:provisioning:</w:t>
+            </w:r>
+            <w:r>
+              <w:rPr>
+                <w:rFonts w:ascii="Courier New" w:hAnsi="Courier New" w:cs="Courier New"/>
+                <w:noProof/>
+                <w:sz w:val="18"/>
+                <w:szCs w:val="18"/>
+              </w:rPr>
+              <w:t>scim:2.0:basic</w:t>
+            </w:r>
+            <w:r>
+              <w:rPr>
+                <w:rFonts w:ascii="Courier New" w:hAnsi="Courier New" w:cs="Courier New"/>
+                <w:noProof/>
+                <w:sz w:val="18"/>
+                <w:szCs w:val="18"/>
+              </w:rPr>
+              <w:t>"],</w:t>
             </w:r>
           </w:p>
           <w:p>
@@ -5228,14 +5820,42 @@
                 <w:szCs w:val="18"/>
               </w:rPr>
             </w:pPr>
-            <w:r>
-              <w:rPr>
-                <w:rFonts w:ascii="Courier New" w:hAnsi="Courier New" w:cs="Courier New"/>
-                <w:noProof/>
-                <w:sz w:val="18"/>
-                <w:szCs w:val="18"/>
-              </w:rPr>
-              <w:t xml:space="preserve">   "urn:ietf:params:fastfed:1.0:authentication:SAML:Basic": {</w:t>
+          </w:p>
+          <w:p>
+            <w:pPr>
+              <w:rPr>
+                <w:rFonts w:ascii="Courier New" w:hAnsi="Courier New" w:cs="Courier New"/>
+                <w:noProof/>
+                <w:sz w:val="18"/>
+                <w:szCs w:val="18"/>
+              </w:rPr>
+            </w:pPr>
+            <w:r>
+              <w:rPr>
+                <w:rFonts w:ascii="Courier New" w:hAnsi="Courier New" w:cs="Courier New"/>
+                <w:noProof/>
+                <w:sz w:val="18"/>
+                <w:szCs w:val="18"/>
+              </w:rPr>
+              <w:t xml:space="preserve">   "urn:ietf:params:fastfed:1.0:authentication:</w:t>
+            </w:r>
+            <w:r>
+              <w:rPr>
+                <w:rFonts w:ascii="Courier New" w:hAnsi="Courier New" w:cs="Courier New"/>
+                <w:noProof/>
+                <w:sz w:val="18"/>
+                <w:szCs w:val="18"/>
+              </w:rPr>
+              <w:t>saml:2.0:basic</w:t>
+            </w:r>
+            <w:r>
+              <w:rPr>
+                <w:rFonts w:ascii="Courier New" w:hAnsi="Courier New" w:cs="Courier New"/>
+                <w:noProof/>
+                <w:sz w:val="18"/>
+                <w:szCs w:val="18"/>
+              </w:rPr>
+              <w:t>": {</w:t>
             </w:r>
           </w:p>
           <w:p>
@@ -5302,14 +5922,42 @@
               </w:rPr>
               <w:br/>
             </w:r>
-            <w:r>
-              <w:rPr>
-                <w:rFonts w:ascii="Courier New" w:hAnsi="Courier New" w:cs="Courier New"/>
-                <w:noProof/>
-                <w:sz w:val="18"/>
-                <w:szCs w:val="18"/>
-              </w:rPr>
-              <w:t xml:space="preserve">   "urn:ietf:params:fastfed:1.0:provisioning:SCIM:FullLifeCycle": {</w:t>
+          </w:p>
+          <w:p>
+            <w:pPr>
+              <w:rPr>
+                <w:rFonts w:ascii="Courier New" w:hAnsi="Courier New" w:cs="Courier New"/>
+                <w:noProof/>
+                <w:sz w:val="18"/>
+                <w:szCs w:val="18"/>
+              </w:rPr>
+            </w:pPr>
+            <w:r>
+              <w:rPr>
+                <w:rFonts w:ascii="Courier New" w:hAnsi="Courier New" w:cs="Courier New"/>
+                <w:noProof/>
+                <w:sz w:val="18"/>
+                <w:szCs w:val="18"/>
+              </w:rPr>
+              <w:t xml:space="preserve">   "urn:ietf:params:fastfed:1.0:provisioning:</w:t>
+            </w:r>
+            <w:r>
+              <w:rPr>
+                <w:rFonts w:ascii="Courier New" w:hAnsi="Courier New" w:cs="Courier New"/>
+                <w:noProof/>
+                <w:sz w:val="18"/>
+                <w:szCs w:val="18"/>
+              </w:rPr>
+              <w:t>scim:2.0:basic</w:t>
+            </w:r>
+            <w:r>
+              <w:rPr>
+                <w:rFonts w:ascii="Courier New" w:hAnsi="Courier New" w:cs="Courier New"/>
+                <w:noProof/>
+                <w:sz w:val="18"/>
+                <w:szCs w:val="18"/>
+              </w:rPr>
+              <w:t>": {</w:t>
             </w:r>
           </w:p>
           <w:p>
@@ -5514,7 +6162,28 @@
                 <w:sz w:val="18"/>
                 <w:szCs w:val="18"/>
               </w:rPr>
-              <w:t xml:space="preserve">       "urn:ietf:params:fastfed:1.0:provider_authentication:OAuth-2.0:JWTProfile": {</w:t>
+              <w:lastRenderedPageBreak/>
+              <w:t xml:space="preserve">       "urn:ietf:params:fastfed:1.0:provider_authentication:</w:t>
+            </w:r>
+            <w:bookmarkStart w:id="0" w:name="_GoBack"/>
+            <w:bookmarkEnd w:id="0"/>
+            <w:r>
+              <w:rPr>
+                <w:rFonts w:ascii="Courier New" w:hAnsi="Courier New" w:cs="Courier New"/>
+                <w:noProof/>
+                <w:sz w:val="18"/>
+                <w:szCs w:val="18"/>
+              </w:rPr>
+              <w:t>oauth:2.0:jwt_profile</w:t>
+            </w:r>
+            <w:r>
+              <w:rPr>
+                <w:rFonts w:ascii="Courier New" w:hAnsi="Courier New" w:cs="Courier New"/>
+                <w:noProof/>
+                <w:sz w:val="18"/>
+                <w:szCs w:val="18"/>
+              </w:rPr>
+              <w:t>": {</w:t>
             </w:r>
           </w:p>
           <w:p>
@@ -5685,7 +6354,16 @@
                 <w:sz w:val="18"/>
                 <w:szCs w:val="18"/>
               </w:rPr>
-              <w:t>POST /fastfed/handshake/finish</w:t>
+              <w:t>POST /fastfed/</w:t>
+            </w:r>
+            <w:r>
+              <w:rPr>
+                <w:rFonts w:ascii="Courier New" w:hAnsi="Courier New" w:cs="Courier New"/>
+                <w:noProof/>
+                <w:sz w:val="18"/>
+                <w:szCs w:val="18"/>
+              </w:rPr>
+              <w:t>register</w:t>
             </w:r>
           </w:p>
           <w:p>
@@ -6299,14 +6977,42 @@
                 <w:szCs w:val="18"/>
               </w:rPr>
             </w:pPr>
-            <w:r>
-              <w:rPr>
-                <w:rFonts w:ascii="Courier New" w:hAnsi="Courier New" w:cs="Courier New"/>
-                <w:noProof/>
-                <w:sz w:val="18"/>
-                <w:szCs w:val="18"/>
-              </w:rPr>
-              <w:t xml:space="preserve">   "urn:ietf:params:fastfed:1.0:authentication:SAML:Basic": {</w:t>
+          </w:p>
+          <w:p>
+            <w:pPr>
+              <w:rPr>
+                <w:rFonts w:ascii="Courier New" w:hAnsi="Courier New" w:cs="Courier New"/>
+                <w:noProof/>
+                <w:sz w:val="18"/>
+                <w:szCs w:val="18"/>
+              </w:rPr>
+            </w:pPr>
+            <w:r>
+              <w:rPr>
+                <w:rFonts w:ascii="Courier New" w:hAnsi="Courier New" w:cs="Courier New"/>
+                <w:noProof/>
+                <w:sz w:val="18"/>
+                <w:szCs w:val="18"/>
+              </w:rPr>
+              <w:t xml:space="preserve">   "urn:ietf:params:fastfed:1.0:authentication:</w:t>
+            </w:r>
+            <w:r>
+              <w:rPr>
+                <w:rFonts w:ascii="Courier New" w:hAnsi="Courier New" w:cs="Courier New"/>
+                <w:noProof/>
+                <w:sz w:val="18"/>
+                <w:szCs w:val="18"/>
+              </w:rPr>
+              <w:t>saml:2.0:basic</w:t>
+            </w:r>
+            <w:r>
+              <w:rPr>
+                <w:rFonts w:ascii="Courier New" w:hAnsi="Courier New" w:cs="Courier New"/>
+                <w:noProof/>
+                <w:sz w:val="18"/>
+                <w:szCs w:val="18"/>
+              </w:rPr>
+              <w:t>": {</w:t>
             </w:r>
           </w:p>
           <w:p>
@@ -6374,14 +7080,42 @@
                 <w:szCs w:val="18"/>
               </w:rPr>
             </w:pPr>
-            <w:r>
-              <w:rPr>
-                <w:rFonts w:ascii="Courier New" w:hAnsi="Courier New" w:cs="Courier New"/>
-                <w:noProof/>
-                <w:sz w:val="18"/>
-                <w:szCs w:val="18"/>
-              </w:rPr>
-              <w:t xml:space="preserve">   "urn:ietf:params:fastfed:1.0:provisioning:SCIM:FullLifeCycle": {</w:t>
+          </w:p>
+          <w:p>
+            <w:pPr>
+              <w:rPr>
+                <w:rFonts w:ascii="Courier New" w:hAnsi="Courier New" w:cs="Courier New"/>
+                <w:noProof/>
+                <w:sz w:val="18"/>
+                <w:szCs w:val="18"/>
+              </w:rPr>
+            </w:pPr>
+            <w:r>
+              <w:rPr>
+                <w:rFonts w:ascii="Courier New" w:hAnsi="Courier New" w:cs="Courier New"/>
+                <w:noProof/>
+                <w:sz w:val="18"/>
+                <w:szCs w:val="18"/>
+              </w:rPr>
+              <w:t xml:space="preserve">   "urn:ietf:params:fastfed:1.0:provisioning:</w:t>
+            </w:r>
+            <w:r>
+              <w:rPr>
+                <w:rFonts w:ascii="Courier New" w:hAnsi="Courier New" w:cs="Courier New"/>
+                <w:noProof/>
+                <w:sz w:val="18"/>
+                <w:szCs w:val="18"/>
+              </w:rPr>
+              <w:t>scim:2.0:basic</w:t>
+            </w:r>
+            <w:r>
+              <w:rPr>
+                <w:rFonts w:ascii="Courier New" w:hAnsi="Courier New" w:cs="Courier New"/>
+                <w:noProof/>
+                <w:sz w:val="18"/>
+                <w:szCs w:val="18"/>
+              </w:rPr>
+              <w:t>": {</w:t>
             </w:r>
           </w:p>
           <w:p>
@@ -6484,6 +7218,7 @@
                 <w:sz w:val="18"/>
                 <w:szCs w:val="18"/>
               </w:rPr>
+              <w:lastRenderedPageBreak/>
               <w:t xml:space="preserve">       </w:t>
             </w:r>
             <w:r>
@@ -6493,26 +7228,72 @@
                 <w:sz w:val="18"/>
                 <w:szCs w:val="18"/>
               </w:rPr>
-              <w:t>"urn:ietf:params:fastfed:1.0:provider_authentication:OAuth-2.0:JWTProfile",</w:t>
-            </w:r>
-          </w:p>
-          <w:p>
-            <w:pPr>
-              <w:rPr>
-                <w:rFonts w:ascii="Courier New" w:hAnsi="Courier New" w:cs="Courier New"/>
-                <w:noProof/>
-                <w:sz w:val="18"/>
-                <w:szCs w:val="18"/>
-              </w:rPr>
-            </w:pPr>
-            <w:r>
-              <w:rPr>
-                <w:rFonts w:ascii="Courier New" w:hAnsi="Courier New" w:cs="Courier New"/>
-                <w:noProof/>
-                <w:sz w:val="18"/>
-                <w:szCs w:val="18"/>
-              </w:rPr>
-              <w:t xml:space="preserve">     "urn:ietf:params:fastfed:1.0:provider_authentication:OAuth-2.0:JWTProfile":</w:t>
+              <w:t>"urn:ietf:params:fastfed:1.0:provider_authentication:</w:t>
+            </w:r>
+            <w:r>
+              <w:rPr>
+                <w:rFonts w:ascii="Courier New" w:hAnsi="Courier New" w:cs="Courier New"/>
+                <w:noProof/>
+                <w:sz w:val="18"/>
+                <w:szCs w:val="18"/>
+              </w:rPr>
+              <w:t>oauth:2.0:jwt_profile</w:t>
+            </w:r>
+            <w:r>
+              <w:rPr>
+                <w:rFonts w:ascii="Courier New" w:hAnsi="Courier New" w:cs="Courier New"/>
+                <w:noProof/>
+                <w:sz w:val="18"/>
+                <w:szCs w:val="18"/>
+              </w:rPr>
+              <w:t>",</w:t>
+            </w:r>
+          </w:p>
+          <w:p>
+            <w:pPr>
+              <w:rPr>
+                <w:rFonts w:ascii="Courier New" w:hAnsi="Courier New" w:cs="Courier New"/>
+                <w:noProof/>
+                <w:sz w:val="18"/>
+                <w:szCs w:val="18"/>
+              </w:rPr>
+            </w:pPr>
+          </w:p>
+          <w:p>
+            <w:pPr>
+              <w:rPr>
+                <w:rFonts w:ascii="Courier New" w:hAnsi="Courier New" w:cs="Courier New"/>
+                <w:noProof/>
+                <w:sz w:val="18"/>
+                <w:szCs w:val="18"/>
+              </w:rPr>
+            </w:pPr>
+            <w:r>
+              <w:rPr>
+                <w:rFonts w:ascii="Courier New" w:hAnsi="Courier New" w:cs="Courier New"/>
+                <w:noProof/>
+                <w:sz w:val="18"/>
+                <w:szCs w:val="18"/>
+              </w:rPr>
+              <w:t xml:space="preserve">     "urn:ietf:params:fastfed:1.0:provider_authentication:</w:t>
+            </w:r>
+            <w:r>
+              <w:rPr>
+                <w:rFonts w:ascii="Courier New" w:hAnsi="Courier New" w:cs="Courier New"/>
+                <w:noProof/>
+                <w:sz w:val="18"/>
+                <w:szCs w:val="18"/>
+              </w:rPr>
+              <w:t>oauth:2.0:jwt_profile</w:t>
+            </w:r>
+            <w:r>
+              <w:rPr>
+                <w:rFonts w:ascii="Courier New" w:hAnsi="Courier New" w:cs="Courier New"/>
+                <w:noProof/>
+                <w:sz w:val="18"/>
+                <w:szCs w:val="18"/>
+              </w:rPr>
+              <w:t>":</w:t>
             </w:r>
           </w:p>
           <w:p>
@@ -6719,7 +7500,15 @@
     <w:p/>
     <w:p>
       <w:r>
-        <w:t>Depending on the implementation of the Identity Provider, it may take additional time to finish activating the capabilities due to the nature of data propagation latencies, asyncronous workflows, etc.</w:t>
+        <w:t xml:space="preserve">Depending on the implementation of the Identity Provider, it may take additional time to finish activating the capabilities due to the nature of data propagation latencies, </w:t>
+      </w:r>
+      <w:proofErr w:type="spellStart"/>
+      <w:r>
+        <w:t>asyncronous</w:t>
+      </w:r>
+      <w:proofErr w:type="spellEnd"/>
+      <w:r>
+        <w:t xml:space="preserve"> workflows, etc.</w:t>
       </w:r>
     </w:p>
     <w:p>
@@ -6771,7 +7560,13 @@
     </w:p>
     <w:p>
       <w:r>
-        <w:t>If OnlineService.com provided a finalization callback URI (Step 12), the Identity Provider will invoke this endpoint when it has finished activating all the capabilities and is ready to handle end-user traffic.</w:t>
+        <w:t>If OnlineService.com provided a finalization callback URI (</w:t>
+      </w:r>
+      <w:r>
+        <w:t>see s</w:t>
+      </w:r>
+      <w:r>
+        <w:t>tep 12), the Identity Provider will invoke this endpoint when it has finished activating all the capabilities and is ready to handle end-user traffic.</w:t>
       </w:r>
     </w:p>
     <w:p/>
@@ -7000,7 +7795,25 @@
           <w:sz w:val="20"/>
           <w:szCs w:val="20"/>
         </w:rPr>
-        <w:t>Identity Provider POSTs the serialized JWT to OnlineService.com</w:t>
+        <w:t xml:space="preserve">Identity Provider </w:t>
+      </w:r>
+      <w:r>
+        <w:rPr>
+          <w:i/>
+          <w:noProof/>
+          <w:sz w:val="20"/>
+          <w:szCs w:val="20"/>
+        </w:rPr>
+        <w:t>post</w:t>
+      </w:r>
+      <w:r>
+        <w:rPr>
+          <w:i/>
+          <w:noProof/>
+          <w:sz w:val="20"/>
+          <w:szCs w:val="20"/>
+        </w:rPr>
+        <w:t>s the serialized JWT to OnlineService.com</w:t>
       </w:r>
     </w:p>
     <w:tbl>
@@ -8249,7 +9062,7 @@
     </w:rPrDefault>
     <w:pPrDefault/>
   </w:docDefaults>
-  <w:latentStyles w:defLockedState="0" w:defUIPriority="99" w:defSemiHidden="0" w:defUnhideWhenUsed="0" w:defQFormat="0" w:count="377">
+  <w:latentStyles w:defLockedState="0" w:defUIPriority="99" w:defSemiHidden="0" w:defUnhideWhenUsed="0" w:defQFormat="0" w:count="376">
     <w:lsdException w:name="Normal" w:uiPriority="0" w:qFormat="1"/>
     <w:lsdException w:name="heading 1" w:uiPriority="9" w:qFormat="1"/>
     <w:lsdException w:name="heading 2" w:semiHidden="1" w:uiPriority="9" w:unhideWhenUsed="1" w:qFormat="1"/>
@@ -8355,6 +9168,7 @@
     <w:lsdException w:name="HTML Sample" w:semiHidden="1" w:unhideWhenUsed="1"/>
     <w:lsdException w:name="HTML Typewriter" w:semiHidden="1" w:unhideWhenUsed="1"/>
     <w:lsdException w:name="HTML Variable" w:semiHidden="1" w:unhideWhenUsed="1"/>
+    <w:lsdException w:name="Normal Table" w:semiHidden="1" w:unhideWhenUsed="1"/>
     <w:lsdException w:name="annotation subject" w:semiHidden="1" w:unhideWhenUsed="1"/>
     <w:lsdException w:name="No List" w:semiHidden="1" w:unhideWhenUsed="1"/>
     <w:lsdException w:name="Outline List 1" w:semiHidden="1" w:unhideWhenUsed="1"/>
@@ -8400,9 +9214,11 @@
     <w:lsdException w:name="Table Subtle 1" w:semiHidden="1" w:unhideWhenUsed="1"/>
     <w:lsdException w:name="Table Subtle 2" w:semiHidden="1" w:unhideWhenUsed="1"/>
     <w:lsdException w:name="Table Web 1" w:semiHidden="1" w:unhideWhenUsed="1"/>
+    <w:lsdException w:name="Table Web 2" w:semiHidden="1" w:unhideWhenUsed="1"/>
     <w:lsdException w:name="Table Web 3" w:semiHidden="1" w:unhideWhenUsed="1"/>
     <w:lsdException w:name="Balloon Text" w:semiHidden="1" w:unhideWhenUsed="1"/>
     <w:lsdException w:name="Table Grid" w:uiPriority="39"/>
+    <w:lsdException w:name="Table Theme" w:semiHidden="1" w:unhideWhenUsed="1"/>
     <w:lsdException w:name="Placeholder Text" w:semiHidden="1"/>
     <w:lsdException w:name="No Spacing" w:uiPriority="1" w:qFormat="1"/>
     <w:lsdException w:name="Light Shading" w:uiPriority="60"/>
@@ -8623,7 +9439,6 @@
     <w:lsdException w:name="Hashtag" w:semiHidden="1" w:unhideWhenUsed="1"/>
     <w:lsdException w:name="Unresolved Mention" w:semiHidden="1" w:unhideWhenUsed="1"/>
     <w:lsdException w:name="Smart Link" w:semiHidden="1" w:unhideWhenUsed="1"/>
-    <w:lsdException w:name="Smart Link Error" w:semiHidden="1" w:unhideWhenUsed="1"/>
   </w:latentStyles>
   <w:style w:type="paragraph" w:default="1" w:styleId="Normal">
     <w:name w:val="Normal"/>
@@ -9213,7 +10028,7 @@
 </file>
 
 <file path=customXml/itemProps1.xml><?xml version="1.0" encoding="utf-8"?>
-<ds:datastoreItem xmlns:ds="http://schemas.openxmlformats.org/officeDocument/2006/customXml" ds:itemID="{6AAB478E-392B-084D-8EFB-675D844D5E2A}">
+<ds:datastoreItem xmlns:ds="http://schemas.openxmlformats.org/officeDocument/2006/customXml" ds:itemID="{3DDEFEA5-4FC0-7F41-B129-308E803AEC05}">
   <ds:schemaRefs>
     <ds:schemaRef ds:uri="http://schemas.openxmlformats.org/officeDocument/2006/bibliography"/>
   </ds:schemaRefs>

</xml_diff>